<commit_message>
docs: update CyberSentinel Project Report docx with module details
</commit_message>
<xml_diff>
--- a/docs/CyberSentinel_Project_Report.docx
+++ b/docs/CyberSentinel_Project_Report.docx
@@ -498,156 +498,390 @@
       </w:tblGrid>
       <w:tr>
         <w:tc>
-          <w:p/>
-        </w:tc>
-        <w:tc>
-          <w:p/>
-        </w:tc>
-        <w:tc>
-          <w:p/>
+          <w:tcPr/>
+          <w:p>
+            <w:pPr>
+              <w:rPr>
+                <w:b/>
+              </w:rPr>
+            </w:pPr>
+            <w:r>
+              <w:rPr>
+                <w:b/>
+              </w:rPr>
+              <w:t xml:space="preserve">Module</w:t>
+            </w:r>
+          </w:p>
+        </w:tc>
+        <w:tc>
+          <w:tcPr/>
+          <w:p>
+            <w:pPr>
+              <w:rPr>
+                <w:b/>
+              </w:rPr>
+            </w:pPr>
+            <w:r>
+              <w:rPr>
+                <w:b/>
+              </w:rPr>
+              <w:t xml:space="preserve">Description</w:t>
+            </w:r>
+          </w:p>
+        </w:tc>
+        <w:tc>
+          <w:tcPr/>
+          <w:p>
+            <w:pPr>
+              <w:rPr>
+                <w:b/>
+              </w:rPr>
+            </w:pPr>
+            <w:r>
+              <w:rPr>
+                <w:b/>
+              </w:rPr>
+              <w:t xml:space="preserve">Key Technologies</w:t>
+            </w:r>
+          </w:p>
         </w:tc>
       </w:tr>
       <w:tr>
         <w:tc>
-          <w:p/>
-        </w:tc>
-        <w:tc>
-          <w:p/>
-        </w:tc>
-        <w:tc>
-          <w:p/>
+          <w:tcPr/>
+          <w:p>
+            <w:r>
+              <w:t xml:space="preserve">3D Security Command Centre</w:t>
+            </w:r>
+          </w:p>
+        </w:tc>
+        <w:tc>
+          <w:tcPr/>
+          <w:p>
+            <w:r>
+              <w:t xml:space="preserve">Holographic security core with real-time threat gauges, incident radar, and interactive vulnerability metrics.</w:t>
+            </w:r>
+          </w:p>
+        </w:tc>
+        <w:tc>
+          <w:tcPr/>
+          <w:p>
+            <w:r>
+              <w:t xml:space="preserve">Three.js, React Three Fiber, Drei</w:t>
+            </w:r>
+          </w:p>
         </w:tc>
       </w:tr>
       <w:tr>
         <w:tc>
-          <w:p/>
-        </w:tc>
-        <w:tc>
-          <w:p/>
-        </w:tc>
-        <w:tc>
-          <w:p/>
+          <w:tcPr/>
+          <w:p>
+            <w:r>
+              <w:t xml:space="preserve">Web Security Scanner</w:t>
+            </w:r>
+          </w:p>
+        </w:tc>
+        <w:tc>
+          <w:tcPr/>
+          <w:p>
+            <w:r>
+              <w:t xml:space="preserve">Automated HTTPS, HSTS, CSP, X-Frame-Options, CORS misconfiguration, and OWASP ZAP dynamic scanning.</w:t>
+            </w:r>
+          </w:p>
+        </w:tc>
+        <w:tc>
+          <w:tcPr/>
+          <w:p>
+            <w:r>
+              <w:t xml:space="preserve">python-zapv2, sslyze, requests</w:t>
+            </w:r>
+          </w:p>
         </w:tc>
       </w:tr>
       <w:tr>
         <w:tc>
-          <w:p/>
-        </w:tc>
-        <w:tc>
-          <w:p/>
-        </w:tc>
-        <w:tc>
-          <w:p/>
+          <w:tcPr/>
+          <w:p>
+            <w:r>
+              <w:t xml:space="preserve">API Security Scanner</w:t>
+            </w:r>
+          </w:p>
+        </w:tc>
+        <w:tc>
+          <w:tcPr/>
+          <w:p>
+            <w:r>
+              <w:t xml:space="preserve">Audits OpenAPI/Swagger schemas for OWASP API Top 10, auth gaps, rate limiting, and parameter validation.</w:t>
+            </w:r>
+          </w:p>
+        </w:tc>
+        <w:tc>
+          <w:tcPr/>
+          <w:p>
+            <w:r>
+              <w:t xml:space="preserve">openapi-spec-validator, prance</w:t>
+            </w:r>
+          </w:p>
         </w:tc>
       </w:tr>
       <w:tr>
         <w:tc>
-          <w:p/>
-        </w:tc>
-        <w:tc>
-          <w:p/>
-        </w:tc>
-        <w:tc>
-          <w:p/>
+          <w:tcPr/>
+          <w:p>
+            <w:r>
+              <w:t xml:space="preserve">Vulnerability Management</w:t>
+            </w:r>
+          </w:p>
+        </w:tc>
+        <w:tc>
+          <w:tcPr/>
+          <w:p>
+            <w:r>
+              <w:t xml:space="preserve">Full lifecycle: Discovered, In Progress, Verified, Resolved. Mapped to CVE, CWE, and CVSS v3.</w:t>
+            </w:r>
+          </w:p>
+        </w:tc>
+        <w:tc>
+          <w:tcPr/>
+          <w:p>
+            <w:r>
+              <w:t xml:space="preserve">Django ORM, DRF</w:t>
+            </w:r>
+          </w:p>
         </w:tc>
       </w:tr>
       <w:tr>
         <w:tc>
-          <w:p/>
-        </w:tc>
-        <w:tc>
-          <w:p/>
-        </w:tc>
-        <w:tc>
-          <w:p/>
+          <w:tcPr/>
+          <w:p>
+            <w:r>
+              <w:t xml:space="preserve">SIEM &amp; Live Event Feed</w:t>
+            </w:r>
+          </w:p>
+        </w:tc>
+        <w:tc>
+          <w:tcPr/>
+          <w:p>
+            <w:r>
+              <w:t xml:space="preserve">High-throughput event ingestion with sub-second alert streaming over WebSockets to connected dashboards.</w:t>
+            </w:r>
+          </w:p>
+        </w:tc>
+        <w:tc>
+          <w:tcPr/>
+          <w:p>
+            <w:r>
+              <w:t xml:space="preserve">Django Channels, Redis</w:t>
+            </w:r>
+          </w:p>
         </w:tc>
       </w:tr>
       <w:tr>
         <w:tc>
-          <w:p/>
-        </w:tc>
-        <w:tc>
-          <w:p/>
-        </w:tc>
-        <w:tc>
-          <w:p/>
+          <w:tcPr/>
+          <w:p>
+            <w:r>
+              <w:t xml:space="preserve">Threat Detection Engine</w:t>
+            </w:r>
+          </w:p>
+        </w:tc>
+        <w:tc>
+          <w:tcPr/>
+          <w:p>
+            <w:r>
+              <w:t xml:space="preserve">Stateful rule engine flagging brute force, credential stuffing, anomalous IP bursts, and unauthorised admin access.</w:t>
+            </w:r>
+          </w:p>
+        </w:tc>
+        <w:tc>
+          <w:tcPr/>
+          <w:p>
+            <w:r>
+              <w:t xml:space="preserve">Celery, Django signals</w:t>
+            </w:r>
+          </w:p>
         </w:tc>
       </w:tr>
       <w:tr>
         <w:tc>
-          <w:p/>
-        </w:tc>
-        <w:tc>
-          <w:p/>
-        </w:tc>
-        <w:tc>
-          <w:p/>
+          <w:tcPr/>
+          <w:p>
+            <w:r>
+              <w:t xml:space="preserve">Threat Intelligence</w:t>
+            </w:r>
+          </w:p>
+        </w:tc>
+        <w:tc>
+          <w:tcPr/>
+          <w:p>
+            <w:r>
+              <w:t xml:space="preserve">IOC lookups (IP, domain, hash) against VirusTotal, AlienVault OTX, and AbuseIPDB with Redis caching.</w:t>
+            </w:r>
+          </w:p>
+        </w:tc>
+        <w:tc>
+          <w:tcPr/>
+          <w:p>
+            <w:r>
+              <w:t xml:space="preserve">requests, Redis cache</w:t>
+            </w:r>
+          </w:p>
         </w:tc>
       </w:tr>
       <w:tr>
         <w:tc>
-          <w:p/>
-        </w:tc>
-        <w:tc>
-          <w:p/>
-        </w:tc>
-        <w:tc>
-          <w:p/>
+          <w:tcPr/>
+          <w:p>
+            <w:r>
+              <w:t xml:space="preserve">Dynamic Risk Engine</w:t>
+            </w:r>
+          </w:p>
+        </w:tc>
+        <w:tc>
+          <w:tcPr/>
+          <w:p>
+            <w:r>
+              <w:t xml:space="preserve">Asset risk posture scoring using asset criticality, network exposure, linked CVEs, and active incident trends.</w:t>
+            </w:r>
+          </w:p>
+        </w:tc>
+        <w:tc>
+          <w:tcPr/>
+          <w:p>
+            <w:r>
+              <w:t xml:space="preserve">NumPy, SciPy, Celery</w:t>
+            </w:r>
+          </w:p>
         </w:tc>
       </w:tr>
       <w:tr>
         <w:tc>
-          <w:p/>
-        </w:tc>
-        <w:tc>
-          <w:p/>
-        </w:tc>
-        <w:tc>
-          <w:p/>
+          <w:tcPr/>
+          <w:p>
+            <w:r>
+              <w:t xml:space="preserve">Incident Response</w:t>
+            </w:r>
+          </w:p>
+        </w:tc>
+        <w:tc>
+          <w:tcPr/>
+          <w:p>
+            <w:r>
+              <w:t xml:space="preserve">SOC-grade ticket system with severity levels, forensic timeline, evidence log, and analyst task assignment.</w:t>
+            </w:r>
+          </w:p>
+        </w:tc>
+        <w:tc>
+          <w:tcPr/>
+          <w:p>
+            <w:r>
+              <w:t xml:space="preserve">Django ORM, DRF</w:t>
+            </w:r>
+          </w:p>
         </w:tc>
       </w:tr>
       <w:tr>
         <w:tc>
-          <w:p/>
-        </w:tc>
-        <w:tc>
-          <w:p/>
-        </w:tc>
-        <w:tc>
-          <w:p/>
+          <w:tcPr/>
+          <w:p>
+            <w:r>
+              <w:t xml:space="preserve">AI Security Analyst</w:t>
+            </w:r>
+          </w:p>
+        </w:tc>
+        <w:tc>
+          <w:tcPr/>
+          <w:p>
+            <w:r>
+              <w:t xml:space="preserve">OpenAI GPT triage translating security findings into plain-English root causes and copy-paste remediation code.</w:t>
+            </w:r>
+          </w:p>
+        </w:tc>
+        <w:tc>
+          <w:tcPr/>
+          <w:p>
+            <w:r>
+              <w:t xml:space="preserve">openai SDK, Celery</w:t>
+            </w:r>
+          </w:p>
         </w:tc>
       </w:tr>
       <w:tr>
         <w:tc>
-          <w:p/>
-        </w:tc>
-        <w:tc>
-          <w:p/>
-        </w:tc>
-        <w:tc>
-          <w:p/>
+          <w:tcPr/>
+          <w:p>
+            <w:r>
+              <w:t xml:space="preserve">DevSecOps Integration</w:t>
+            </w:r>
+          </w:p>
+        </w:tc>
+        <w:tc>
+          <w:tcPr/>
+          <w:p>
+            <w:r>
+              <w:t xml:space="preserve">Webhook receiver parsing SAST (Bandit, Semgrep), dependency audit (Trivy), and IaC analysis (Checkov) results.</w:t>
+            </w:r>
+          </w:p>
+        </w:tc>
+        <w:tc>
+          <w:tcPr/>
+          <w:p>
+            <w:r>
+              <w:t xml:space="preserve">Django views, GitHub Actions</w:t>
+            </w:r>
+          </w:p>
         </w:tc>
       </w:tr>
       <w:tr>
         <w:tc>
-          <w:p/>
-        </w:tc>
-        <w:tc>
-          <w:p/>
-        </w:tc>
-        <w:tc>
-          <w:p/>
+          <w:tcPr/>
+          <w:p>
+            <w:r>
+              <w:t xml:space="preserve">Security Reports</w:t>
+            </w:r>
+          </w:p>
+        </w:tc>
+        <w:tc>
+          <w:tcPr/>
+          <w:p>
+            <w:r>
+              <w:t xml:space="preserve">Generates Executive, Compliance, and Technical vulnerability reports in PDF, CSV, and JSON formats.</w:t>
+            </w:r>
+          </w:p>
+        </w:tc>
+        <w:tc>
+          <w:tcPr/>
+          <w:p>
+            <w:r>
+              <w:t xml:space="preserve">DRF, Python data libs</w:t>
+            </w:r>
+          </w:p>
         </w:tc>
       </w:tr>
       <w:tr>
         <w:tc>
-          <w:p/>
-        </w:tc>
-        <w:tc>
-          <w:p/>
-        </w:tc>
-        <w:tc>
-          <w:p/>
+          <w:tcPr/>
+          <w:p>
+            <w:r>
+              <w:t xml:space="preserve">Multi-Tenancy &amp; RBAC</w:t>
+            </w:r>
+          </w:p>
+        </w:tc>
+        <w:tc>
+          <w:tcPr/>
+          <w:p>
+            <w:r>
+              <w:t xml:space="preserve">Organisation isolation with RBAC: SUPER_ADMIN, SECURITY_ADMIN, ANALYST, DEVELOPER, VIEWER roles.</w:t>
+            </w:r>
+          </w:p>
+        </w:tc>
+        <w:tc>
+          <w:tcPr/>
+          <w:p>
+            <w:r>
+              <w:t xml:space="preserve">Django permissions, SimpleJWT</w:t>
+            </w:r>
+          </w:p>
         </w:tc>
       </w:tr>
     </w:tbl>
@@ -1073,6 +1307,500 @@
           <w:sz w:val="22"/>
         </w:rPr>
         <w:t xml:space="preserve">GitHub Actions: CI/CD security pipeline running Bandit (SAST), Trivy (dependency/image CVE scan), Semgrep (code analysis), and Checkov (IaC scan) on every push and pull request.</w:t>
+      </w:r>
+    </w:p>
+    <w:p>
+      <w:pPr>
+        <w:pStyle w:val="Heading1"/>
+        <w:spacing w:before="400" w:after="160"/>
+      </w:pPr>
+      <w:r>
+        <w:rPr>
+          <w:b/>
+          <w:color w:val="1F2D5A"/>
+          <w:sz w:val="36"/>
+        </w:rPr>
+        <w:t xml:space="preserve">6. Backend Module Descriptions</w:t>
+      </w:r>
+    </w:p>
+    <w:p>
+      <w:pPr>
+        <w:pStyle w:val="Normal"/>
+        <w:spacing w:after="120"/>
+      </w:pPr>
+      <w:r>
+        <w:rPr>
+          <w:sz w:val="22"/>
+        </w:rPr>
+        <w:t xml:space="preserve">The Django backend is organised as a collection of self-contained Django applications, each responsible for a discrete domain.</w:t>
+      </w:r>
+    </w:p>
+    <w:p>
+      <w:pPr>
+        <w:pStyle w:val="Normal"/>
+        <w:numPr>
+          <w:ilvl w:val="0"/>
+          <w:numId w:val="6"/>
+        </w:numPr>
+        <w:spacing w:after="80"/>
+      </w:pPr>
+      <w:r>
+        <w:rPr>
+          <w:sz w:val="22"/>
+        </w:rPr>
+        <w:t xml:space="preserve">accounts — User authentication, JWT token management, Argon2id password hashing, RBAC role assignment, and user profile management.</w:t>
+      </w:r>
+    </w:p>
+    <w:p>
+      <w:pPr>
+        <w:pStyle w:val="Normal"/>
+        <w:numPr>
+          <w:ilvl w:val="0"/>
+          <w:numId w:val="6"/>
+        </w:numPr>
+        <w:spacing w:after="80"/>
+      </w:pPr>
+      <w:r>
+        <w:rPr>
+          <w:sz w:val="22"/>
+        </w:rPr>
+        <w:t xml:space="preserve">organizations — Multi-tenant organisation model. Every resource (assets, incidents, scans) is scoped to an organisation, providing data isolation across tenants.</w:t>
+      </w:r>
+    </w:p>
+    <w:p>
+      <w:pPr>
+        <w:pStyle w:val="Normal"/>
+        <w:numPr>
+          <w:ilvl w:val="0"/>
+          <w:numId w:val="6"/>
+        </w:numPr>
+        <w:spacing w:after="80"/>
+      </w:pPr>
+      <w:r>
+        <w:rPr>
+          <w:sz w:val="22"/>
+        </w:rPr>
+        <w:t xml:space="preserve">assets — Monitored asset registry. Stores domains, IP ranges, API endpoints, and internal services. Each asset carries metadata for risk scoring.</w:t>
+      </w:r>
+    </w:p>
+    <w:p>
+      <w:pPr>
+        <w:pStyle w:val="Normal"/>
+        <w:numPr>
+          <w:ilvl w:val="0"/>
+          <w:numId w:val="6"/>
+        </w:numPr>
+        <w:spacing w:after="80"/>
+      </w:pPr>
+      <w:r>
+        <w:rPr>
+          <w:sz w:val="22"/>
+        </w:rPr>
+        <w:t xml:space="preserve">scans — Web and API scanner orchestration. Dispatches Celery tasks to invoke OWASP ZAP, parse scan results, and persist findings as vulnerabilities.</w:t>
+      </w:r>
+    </w:p>
+    <w:p>
+      <w:pPr>
+        <w:pStyle w:val="Normal"/>
+        <w:numPr>
+          <w:ilvl w:val="0"/>
+          <w:numId w:val="6"/>
+        </w:numPr>
+        <w:spacing w:after="80"/>
+      </w:pPr>
+      <w:r>
+        <w:rPr>
+          <w:sz w:val="22"/>
+        </w:rPr>
+        <w:t xml:space="preserve">vulnerabilities — Full vulnerability lifecycle model. Tracks CVE IDs, CWE classifications, CVSS v3 scores, status transitions, assignees, and remediation notes.</w:t>
+      </w:r>
+    </w:p>
+    <w:p>
+      <w:pPr>
+        <w:pStyle w:val="Normal"/>
+        <w:numPr>
+          <w:ilvl w:val="0"/>
+          <w:numId w:val="6"/>
+        </w:numPr>
+        <w:spacing w:after="80"/>
+      </w:pPr>
+      <w:r>
+        <w:rPr>
+          <w:sz w:val="22"/>
+        </w:rPr>
+        <w:t xml:space="preserve">security_events — SIEM event ingestion. Accepts JSON and syslog-format payloads, persists events, and broadcasts them to connected WebSocket clients via Django Channels.</w:t>
+      </w:r>
+    </w:p>
+    <w:p>
+      <w:pPr>
+        <w:pStyle w:val="Normal"/>
+        <w:numPr>
+          <w:ilvl w:val="0"/>
+          <w:numId w:val="6"/>
+        </w:numPr>
+        <w:spacing w:after="80"/>
+      </w:pPr>
+      <w:r>
+        <w:rPr>
+          <w:sz w:val="22"/>
+        </w:rPr>
+        <w:t xml:space="preserve">detection — Stateful detection rule engine. Rules define conditions (field, operator, threshold, time window). The engine evaluates incoming events and generates alerts.</w:t>
+      </w:r>
+    </w:p>
+    <w:p>
+      <w:pPr>
+        <w:pStyle w:val="Normal"/>
+        <w:numPr>
+          <w:ilvl w:val="0"/>
+          <w:numId w:val="6"/>
+        </w:numPr>
+        <w:spacing w:after="80"/>
+      </w:pPr>
+      <w:r>
+        <w:rPr>
+          <w:sz w:val="22"/>
+        </w:rPr>
+        <w:t xml:space="preserve">threat_intelligence — IOC enrichment module. Queries VirusTotal, AlienVault OTX, and AbuseIPDB via their respective APIs and caches results in Redis for 24 hours.</w:t>
+      </w:r>
+    </w:p>
+    <w:p>
+      <w:pPr>
+        <w:pStyle w:val="Normal"/>
+        <w:numPr>
+          <w:ilvl w:val="0"/>
+          <w:numId w:val="6"/>
+        </w:numPr>
+        <w:spacing w:after="80"/>
+      </w:pPr>
+      <w:r>
+        <w:rPr>
+          <w:sz w:val="22"/>
+        </w:rPr>
+        <w:t xml:space="preserve">risk — Dynamic risk scoring engine. Calculates a composite risk score per asset using a weighted formula over CVE severity, exposure tier, active incidents, and threat matches.</w:t>
+      </w:r>
+    </w:p>
+    <w:p>
+      <w:pPr>
+        <w:pStyle w:val="Normal"/>
+        <w:numPr>
+          <w:ilvl w:val="0"/>
+          <w:numId w:val="6"/>
+        </w:numPr>
+        <w:spacing w:after="80"/>
+      </w:pPr>
+      <w:r>
+        <w:rPr>
+          <w:sz w:val="22"/>
+        </w:rPr>
+        <w:t xml:space="preserve">incidents — SOC incident response workflow. Manages incident lifecycle (New, Investigating, Contained, Resolved), evidence attachments, forensic timeline entries, and analyst assignments.</w:t>
+      </w:r>
+    </w:p>
+    <w:p>
+      <w:pPr>
+        <w:pStyle w:val="Normal"/>
+        <w:numPr>
+          <w:ilvl w:val="0"/>
+          <w:numId w:val="6"/>
+        </w:numPr>
+        <w:spacing w:after="80"/>
+      </w:pPr>
+      <w:r>
+        <w:rPr>
+          <w:sz w:val="22"/>
+        </w:rPr>
+        <w:t xml:space="preserve">ai_analyst — OpenAI GPT integration. Accepts a vulnerability or event context payload, constructs a structured prompt, calls the OpenAI API, and streams the response back to the frontend.</w:t>
+      </w:r>
+    </w:p>
+    <w:p>
+      <w:pPr>
+        <w:pStyle w:val="Normal"/>
+        <w:numPr>
+          <w:ilvl w:val="0"/>
+          <w:numId w:val="6"/>
+        </w:numPr>
+        <w:spacing w:after="80"/>
+      </w:pPr>
+      <w:r>
+        <w:rPr>
+          <w:sz w:val="22"/>
+        </w:rPr>
+        <w:t xml:space="preserve">devsecops — CI/CD webhook receiver. Parses SARIF (Bandit, Semgrep), JSON (Trivy), and CycloneDX (Checkov) report formats into normalised vulnerability records.</w:t>
+      </w:r>
+    </w:p>
+    <w:p>
+      <w:pPr>
+        <w:pStyle w:val="Normal"/>
+        <w:numPr>
+          <w:ilvl w:val="0"/>
+          <w:numId w:val="6"/>
+        </w:numPr>
+        <w:spacing w:after="80"/>
+      </w:pPr>
+      <w:r>
+        <w:rPr>
+          <w:sz w:val="22"/>
+        </w:rPr>
+        <w:t xml:space="preserve">reports — Report generation engine. Aggregates vulnerability, incident, and risk data into Executive, Compliance, and Technical templates exportable as PDF, CSV, or JSON.</w:t>
+      </w:r>
+    </w:p>
+    <w:p>
+      <w:pPr>
+        <w:pStyle w:val="Normal"/>
+        <w:numPr>
+          <w:ilvl w:val="0"/>
+          <w:numId w:val="6"/>
+        </w:numPr>
+        <w:spacing w:after="80"/>
+      </w:pPr>
+      <w:r>
+        <w:rPr>
+          <w:sz w:val="22"/>
+        </w:rPr>
+        <w:t xml:space="preserve">notifications — Alert notification dispatcher. Sends in-app, email, and webhook notifications triggered by detection alerts, scan completions, and high-risk incident creation.</w:t>
+      </w:r>
+    </w:p>
+    <w:p>
+      <w:pPr>
+        <w:pStyle w:val="Normal"/>
+        <w:numPr>
+          <w:ilvl w:val="0"/>
+          <w:numId w:val="6"/>
+        </w:numPr>
+        <w:spacing w:after="160"/>
+      </w:pPr>
+      <w:r>
+        <w:rPr>
+          <w:sz w:val="22"/>
+        </w:rPr>
+        <w:t xml:space="preserve">audit — Immutable audit log. Records every create, update, and delete action on sensitive models, capturing actor, timestamp, IP address, and diff of changed fields.</w:t>
+      </w:r>
+    </w:p>
+    <w:p>
+      <w:pPr>
+        <w:pStyle w:val="Heading1"/>
+        <w:spacing w:before="400" w:after="160"/>
+      </w:pPr>
+      <w:r>
+        <w:rPr>
+          <w:b/>
+          <w:color w:val="1F2D5A"/>
+          <w:sz w:val="36"/>
+        </w:rPr>
+        <w:t xml:space="preserve">7. Security Design</w:t>
+      </w:r>
+    </w:p>
+    <w:p>
+      <w:pPr>
+        <w:pStyle w:val="Normal"/>
+        <w:spacing w:after="160"/>
+      </w:pPr>
+      <w:r>
+        <w:rPr>
+          <w:sz w:val="22"/>
+        </w:rPr>
+        <w:t xml:space="preserve">Security is a first-class concern in CyberSentinel's own design. The following decisions were made during development:</w:t>
+      </w:r>
+    </w:p>
+    <w:p>
+      <w:pPr>
+        <w:pStyle w:val="Heading2"/>
+        <w:spacing w:before="240" w:after="120"/>
+      </w:pPr>
+      <w:r>
+        <w:rPr>
+          <w:b/>
+          <w:color w:val="1F2D5A"/>
+          <w:sz w:val="28"/>
+        </w:rPr>
+        <w:t xml:space="preserve">7.1 Authentication &amp; Authorisation</w:t>
+      </w:r>
+    </w:p>
+    <w:p>
+      <w:pPr>
+        <w:pStyle w:val="Normal"/>
+        <w:numPr>
+          <w:ilvl w:val="0"/>
+          <w:numId w:val="7"/>
+        </w:numPr>
+        <w:spacing w:after="80"/>
+      </w:pPr>
+      <w:r>
+        <w:rPr>
+          <w:sz w:val="22"/>
+        </w:rPr>
+        <w:t xml:space="preserve">Stateless JWT authentication with short-lived access tokens (15 minutes) and long-lived refresh tokens (7 days) stored in HttpOnly cookies. Token rotation on every refresh prevents replay attacks.</w:t>
+      </w:r>
+    </w:p>
+    <w:p>
+      <w:pPr>
+        <w:pStyle w:val="Normal"/>
+        <w:numPr>
+          <w:ilvl w:val="0"/>
+          <w:numId w:val="7"/>
+        </w:numPr>
+        <w:spacing w:after="80"/>
+      </w:pPr>
+      <w:r>
+        <w:rPr>
+          <w:sz w:val="22"/>
+        </w:rPr>
+        <w:t xml:space="preserve">Argon2id password hashing replaces PBKDF2. Argon2id is memory-hard, making GPU-based brute-force attacks economically infeasible.</w:t>
+      </w:r>
+    </w:p>
+    <w:p>
+      <w:pPr>
+        <w:pStyle w:val="Normal"/>
+        <w:numPr>
+          <w:ilvl w:val="0"/>
+          <w:numId w:val="7"/>
+        </w:numPr>
+        <w:spacing w:after="160"/>
+      </w:pPr>
+      <w:r>
+        <w:rPr>
+          <w:sz w:val="22"/>
+        </w:rPr>
+        <w:t xml:space="preserve">Granular RBAC with five predefined roles: SUPER_ADMIN, SECURITY_ADMIN, SECURITY_ANALYST, DEVELOPER, and VIEWER. DRF permission classes enforce per-view role requirements.</w:t>
+      </w:r>
+    </w:p>
+    <w:p>
+      <w:pPr>
+        <w:pStyle w:val="Heading2"/>
+        <w:spacing w:before="240" w:after="120"/>
+      </w:pPr>
+      <w:r>
+        <w:rPr>
+          <w:b/>
+          <w:color w:val="1F2D5A"/>
+          <w:sz w:val="28"/>
+        </w:rPr>
+        <w:t xml:space="preserve">7.2 Transport Security</w:t>
+      </w:r>
+    </w:p>
+    <w:p>
+      <w:pPr>
+        <w:pStyle w:val="Normal"/>
+        <w:numPr>
+          <w:ilvl w:val="0"/>
+          <w:numId w:val="8"/>
+        </w:numPr>
+        <w:spacing w:after="80"/>
+      </w:pPr>
+      <w:r>
+        <w:rPr>
+          <w:sz w:val="22"/>
+        </w:rPr>
+        <w:t xml:space="preserve">All production traffic passes through Nginx, which terminates TLS and enforces HTTPS redirection. HSTS headers with a 1-year max-age and includeSubDomains are set on every response.</w:t>
+      </w:r>
+    </w:p>
+    <w:p>
+      <w:pPr>
+        <w:pStyle w:val="Normal"/>
+        <w:numPr>
+          <w:ilvl w:val="0"/>
+          <w:numId w:val="8"/>
+        </w:numPr>
+        <w:spacing w:after="80"/>
+      </w:pPr>
+      <w:r>
+        <w:rPr>
+          <w:sz w:val="22"/>
+        </w:rPr>
+        <w:t xml:space="preserve">Django CORS headers restrict cross-origin requests to the configured frontend origin. Wildcard origins are not permitted.</w:t>
+      </w:r>
+    </w:p>
+    <w:p>
+      <w:pPr>
+        <w:pStyle w:val="Normal"/>
+        <w:numPr>
+          <w:ilvl w:val="0"/>
+          <w:numId w:val="8"/>
+        </w:numPr>
+        <w:spacing w:after="160"/>
+      </w:pPr>
+      <w:r>
+        <w:rPr>
+          <w:sz w:val="22"/>
+        </w:rPr>
+        <w:t xml:space="preserve">Cookie security flags — Secure, HttpOnly, and SameSite=Strict — are applied to all session and refresh-token cookies.</w:t>
+      </w:r>
+    </w:p>
+    <w:p>
+      <w:pPr>
+        <w:pStyle w:val="Heading2"/>
+        <w:spacing w:before="240" w:after="120"/>
+      </w:pPr>
+      <w:r>
+        <w:rPr>
+          <w:b/>
+          <w:color w:val="1F2D5A"/>
+          <w:sz w:val="28"/>
+        </w:rPr>
+        <w:t xml:space="preserve">7.3 Supply Chain &amp; CI/CD Security</w:t>
+      </w:r>
+    </w:p>
+    <w:p>
+      <w:pPr>
+        <w:pStyle w:val="Normal"/>
+        <w:numPr>
+          <w:ilvl w:val="0"/>
+          <w:numId w:val="9"/>
+        </w:numPr>
+        <w:spacing w:after="80"/>
+      </w:pPr>
+      <w:r>
+        <w:rPr>
+          <w:sz w:val="22"/>
+        </w:rPr>
+        <w:t xml:space="preserve">Bandit scans the Python codebase for common security anti-patterns (e.g. hardcoded secrets, use of eval, SQL injection sinks) on every pull request.</w:t>
+      </w:r>
+    </w:p>
+    <w:p>
+      <w:pPr>
+        <w:pStyle w:val="Normal"/>
+        <w:numPr>
+          <w:ilvl w:val="0"/>
+          <w:numId w:val="9"/>
+        </w:numPr>
+        <w:spacing w:after="80"/>
+      </w:pPr>
+      <w:r>
+        <w:rPr>
+          <w:sz w:val="22"/>
+        </w:rPr>
+        <w:t xml:space="preserve">Trivy scans both the pip and npm dependency trees, as well as Docker image layers, for known CVEs and misconfigurations.</w:t>
+      </w:r>
+    </w:p>
+    <w:p>
+      <w:pPr>
+        <w:pStyle w:val="Normal"/>
+        <w:numPr>
+          <w:ilvl w:val="0"/>
+          <w:numId w:val="9"/>
+        </w:numPr>
+        <w:spacing w:after="80"/>
+      </w:pPr>
+      <w:r>
+        <w:rPr>
+          <w:sz w:val="22"/>
+        </w:rPr>
+        <w:t xml:space="preserve">Semgrep enforces custom rules for Django-specific anti-patterns and OWASP Top 10 CWE categories.</w:t>
+      </w:r>
+    </w:p>
+    <w:p>
+      <w:pPr>
+        <w:pStyle w:val="Normal"/>
+        <w:numPr>
+          <w:ilvl w:val="0"/>
+          <w:numId w:val="9"/>
+        </w:numPr>
+        <w:spacing w:after="160"/>
+      </w:pPr>
+      <w:r>
+        <w:rPr>
+          <w:sz w:val="22"/>
+        </w:rPr>
+        <w:t xml:space="preserve">Checkov validates the docker-compose.yml and Kubernetes manifests for IaC misconfigurations before merge.</w:t>
       </w:r>
     </w:p>
     <w:sectPr>
@@ -1423,6 +2151,342 @@
     </w:lvl>
   </w:abstractNum>
   <w:abstractNum w:abstractNumId="4">
+    <w:multiLevelType w:val="hybridMultilevel"/>
+    <w:lvl w:ilvl="0">
+      <w:start w:val="1"/>
+      <w:numFmt w:val="bullet"/>
+      <w:lvlText w:val="•"/>
+      <w:lvlJc w:val="left"/>
+      <w:pPr>
+        <w:ind w:left="720" w:hanging="360"/>
+      </w:pPr>
+    </w:lvl>
+    <w:lvl w:ilvl="1">
+      <w:start w:val="1"/>
+      <w:numFmt w:val="bullet"/>
+      <w:lvlText w:val="◦"/>
+      <w:lvlJc w:val="left"/>
+      <w:pPr>
+        <w:ind w:left="1440" w:hanging="360"/>
+      </w:pPr>
+    </w:lvl>
+    <w:lvl w:ilvl="2">
+      <w:start w:val="1"/>
+      <w:numFmt w:val="bullet"/>
+      <w:lvlText w:val="▪"/>
+      <w:lvlJc w:val="left"/>
+      <w:pPr>
+        <w:ind w:left="2160" w:hanging="360"/>
+      </w:pPr>
+    </w:lvl>
+    <w:lvl w:ilvl="3">
+      <w:start w:val="1"/>
+      <w:numFmt w:val="bullet"/>
+      <w:lvlText w:val="•"/>
+      <w:lvlJc w:val="left"/>
+      <w:pPr>
+        <w:ind w:left="2880" w:hanging="360"/>
+      </w:pPr>
+    </w:lvl>
+    <w:lvl w:ilvl="4">
+      <w:start w:val="1"/>
+      <w:numFmt w:val="bullet"/>
+      <w:lvlText w:val="◦"/>
+      <w:lvlJc w:val="left"/>
+      <w:pPr>
+        <w:ind w:left="3600" w:hanging="360"/>
+      </w:pPr>
+    </w:lvl>
+    <w:lvl w:ilvl="5">
+      <w:start w:val="1"/>
+      <w:numFmt w:val="bullet"/>
+      <w:lvlText w:val="▪"/>
+      <w:lvlJc w:val="left"/>
+      <w:pPr>
+        <w:ind w:left="4320" w:hanging="360"/>
+      </w:pPr>
+    </w:lvl>
+    <w:lvl w:ilvl="6">
+      <w:start w:val="1"/>
+      <w:numFmt w:val="bullet"/>
+      <w:lvlText w:val="•"/>
+      <w:lvlJc w:val="left"/>
+      <w:pPr>
+        <w:ind w:left="5040" w:hanging="360"/>
+      </w:pPr>
+    </w:lvl>
+    <w:lvl w:ilvl="7">
+      <w:start w:val="1"/>
+      <w:numFmt w:val="bullet"/>
+      <w:lvlText w:val="◦"/>
+      <w:lvlJc w:val="left"/>
+      <w:pPr>
+        <w:ind w:left="5760" w:hanging="360"/>
+      </w:pPr>
+    </w:lvl>
+    <w:lvl w:ilvl="8">
+      <w:start w:val="1"/>
+      <w:numFmt w:val="bullet"/>
+      <w:lvlText w:val="▪"/>
+      <w:lvlJc w:val="left"/>
+      <w:pPr>
+        <w:ind w:left="6480" w:hanging="360"/>
+      </w:pPr>
+    </w:lvl>
+  </w:abstractNum>
+  <w:abstractNum w:abstractNumId="5">
+    <w:multiLevelType w:val="hybridMultilevel"/>
+    <w:lvl w:ilvl="0">
+      <w:start w:val="1"/>
+      <w:numFmt w:val="bullet"/>
+      <w:lvlText w:val="•"/>
+      <w:lvlJc w:val="left"/>
+      <w:pPr>
+        <w:ind w:left="720" w:hanging="360"/>
+      </w:pPr>
+    </w:lvl>
+    <w:lvl w:ilvl="1">
+      <w:start w:val="1"/>
+      <w:numFmt w:val="bullet"/>
+      <w:lvlText w:val="◦"/>
+      <w:lvlJc w:val="left"/>
+      <w:pPr>
+        <w:ind w:left="1440" w:hanging="360"/>
+      </w:pPr>
+    </w:lvl>
+    <w:lvl w:ilvl="2">
+      <w:start w:val="1"/>
+      <w:numFmt w:val="bullet"/>
+      <w:lvlText w:val="▪"/>
+      <w:lvlJc w:val="left"/>
+      <w:pPr>
+        <w:ind w:left="2160" w:hanging="360"/>
+      </w:pPr>
+    </w:lvl>
+    <w:lvl w:ilvl="3">
+      <w:start w:val="1"/>
+      <w:numFmt w:val="bullet"/>
+      <w:lvlText w:val="•"/>
+      <w:lvlJc w:val="left"/>
+      <w:pPr>
+        <w:ind w:left="2880" w:hanging="360"/>
+      </w:pPr>
+    </w:lvl>
+    <w:lvl w:ilvl="4">
+      <w:start w:val="1"/>
+      <w:numFmt w:val="bullet"/>
+      <w:lvlText w:val="◦"/>
+      <w:lvlJc w:val="left"/>
+      <w:pPr>
+        <w:ind w:left="3600" w:hanging="360"/>
+      </w:pPr>
+    </w:lvl>
+    <w:lvl w:ilvl="5">
+      <w:start w:val="1"/>
+      <w:numFmt w:val="bullet"/>
+      <w:lvlText w:val="▪"/>
+      <w:lvlJc w:val="left"/>
+      <w:pPr>
+        <w:ind w:left="4320" w:hanging="360"/>
+      </w:pPr>
+    </w:lvl>
+    <w:lvl w:ilvl="6">
+      <w:start w:val="1"/>
+      <w:numFmt w:val="bullet"/>
+      <w:lvlText w:val="•"/>
+      <w:lvlJc w:val="left"/>
+      <w:pPr>
+        <w:ind w:left="5040" w:hanging="360"/>
+      </w:pPr>
+    </w:lvl>
+    <w:lvl w:ilvl="7">
+      <w:start w:val="1"/>
+      <w:numFmt w:val="bullet"/>
+      <w:lvlText w:val="◦"/>
+      <w:lvlJc w:val="left"/>
+      <w:pPr>
+        <w:ind w:left="5760" w:hanging="360"/>
+      </w:pPr>
+    </w:lvl>
+    <w:lvl w:ilvl="8">
+      <w:start w:val="1"/>
+      <w:numFmt w:val="bullet"/>
+      <w:lvlText w:val="▪"/>
+      <w:lvlJc w:val="left"/>
+      <w:pPr>
+        <w:ind w:left="6480" w:hanging="360"/>
+      </w:pPr>
+    </w:lvl>
+  </w:abstractNum>
+  <w:abstractNum w:abstractNumId="6">
+    <w:multiLevelType w:val="hybridMultilevel"/>
+    <w:lvl w:ilvl="0">
+      <w:start w:val="1"/>
+      <w:numFmt w:val="bullet"/>
+      <w:lvlText w:val="•"/>
+      <w:lvlJc w:val="left"/>
+      <w:pPr>
+        <w:ind w:left="720" w:hanging="360"/>
+      </w:pPr>
+    </w:lvl>
+    <w:lvl w:ilvl="1">
+      <w:start w:val="1"/>
+      <w:numFmt w:val="bullet"/>
+      <w:lvlText w:val="◦"/>
+      <w:lvlJc w:val="left"/>
+      <w:pPr>
+        <w:ind w:left="1440" w:hanging="360"/>
+      </w:pPr>
+    </w:lvl>
+    <w:lvl w:ilvl="2">
+      <w:start w:val="1"/>
+      <w:numFmt w:val="bullet"/>
+      <w:lvlText w:val="▪"/>
+      <w:lvlJc w:val="left"/>
+      <w:pPr>
+        <w:ind w:left="2160" w:hanging="360"/>
+      </w:pPr>
+    </w:lvl>
+    <w:lvl w:ilvl="3">
+      <w:start w:val="1"/>
+      <w:numFmt w:val="bullet"/>
+      <w:lvlText w:val="•"/>
+      <w:lvlJc w:val="left"/>
+      <w:pPr>
+        <w:ind w:left="2880" w:hanging="360"/>
+      </w:pPr>
+    </w:lvl>
+    <w:lvl w:ilvl="4">
+      <w:start w:val="1"/>
+      <w:numFmt w:val="bullet"/>
+      <w:lvlText w:val="◦"/>
+      <w:lvlJc w:val="left"/>
+      <w:pPr>
+        <w:ind w:left="3600" w:hanging="360"/>
+      </w:pPr>
+    </w:lvl>
+    <w:lvl w:ilvl="5">
+      <w:start w:val="1"/>
+      <w:numFmt w:val="bullet"/>
+      <w:lvlText w:val="▪"/>
+      <w:lvlJc w:val="left"/>
+      <w:pPr>
+        <w:ind w:left="4320" w:hanging="360"/>
+      </w:pPr>
+    </w:lvl>
+    <w:lvl w:ilvl="6">
+      <w:start w:val="1"/>
+      <w:numFmt w:val="bullet"/>
+      <w:lvlText w:val="•"/>
+      <w:lvlJc w:val="left"/>
+      <w:pPr>
+        <w:ind w:left="5040" w:hanging="360"/>
+      </w:pPr>
+    </w:lvl>
+    <w:lvl w:ilvl="7">
+      <w:start w:val="1"/>
+      <w:numFmt w:val="bullet"/>
+      <w:lvlText w:val="◦"/>
+      <w:lvlJc w:val="left"/>
+      <w:pPr>
+        <w:ind w:left="5760" w:hanging="360"/>
+      </w:pPr>
+    </w:lvl>
+    <w:lvl w:ilvl="8">
+      <w:start w:val="1"/>
+      <w:numFmt w:val="bullet"/>
+      <w:lvlText w:val="▪"/>
+      <w:lvlJc w:val="left"/>
+      <w:pPr>
+        <w:ind w:left="6480" w:hanging="360"/>
+      </w:pPr>
+    </w:lvl>
+  </w:abstractNum>
+  <w:abstractNum w:abstractNumId="7">
+    <w:multiLevelType w:val="hybridMultilevel"/>
+    <w:lvl w:ilvl="0">
+      <w:start w:val="1"/>
+      <w:numFmt w:val="bullet"/>
+      <w:lvlText w:val="•"/>
+      <w:lvlJc w:val="left"/>
+      <w:pPr>
+        <w:ind w:left="720" w:hanging="360"/>
+      </w:pPr>
+    </w:lvl>
+    <w:lvl w:ilvl="1">
+      <w:start w:val="1"/>
+      <w:numFmt w:val="bullet"/>
+      <w:lvlText w:val="◦"/>
+      <w:lvlJc w:val="left"/>
+      <w:pPr>
+        <w:ind w:left="1440" w:hanging="360"/>
+      </w:pPr>
+    </w:lvl>
+    <w:lvl w:ilvl="2">
+      <w:start w:val="1"/>
+      <w:numFmt w:val="bullet"/>
+      <w:lvlText w:val="▪"/>
+      <w:lvlJc w:val="left"/>
+      <w:pPr>
+        <w:ind w:left="2160" w:hanging="360"/>
+      </w:pPr>
+    </w:lvl>
+    <w:lvl w:ilvl="3">
+      <w:start w:val="1"/>
+      <w:numFmt w:val="bullet"/>
+      <w:lvlText w:val="•"/>
+      <w:lvlJc w:val="left"/>
+      <w:pPr>
+        <w:ind w:left="2880" w:hanging="360"/>
+      </w:pPr>
+    </w:lvl>
+    <w:lvl w:ilvl="4">
+      <w:start w:val="1"/>
+      <w:numFmt w:val="bullet"/>
+      <w:lvlText w:val="◦"/>
+      <w:lvlJc w:val="left"/>
+      <w:pPr>
+        <w:ind w:left="3600" w:hanging="360"/>
+      </w:pPr>
+    </w:lvl>
+    <w:lvl w:ilvl="5">
+      <w:start w:val="1"/>
+      <w:numFmt w:val="bullet"/>
+      <w:lvlText w:val="▪"/>
+      <w:lvlJc w:val="left"/>
+      <w:pPr>
+        <w:ind w:left="4320" w:hanging="360"/>
+      </w:pPr>
+    </w:lvl>
+    <w:lvl w:ilvl="6">
+      <w:start w:val="1"/>
+      <w:numFmt w:val="bullet"/>
+      <w:lvlText w:val="•"/>
+      <w:lvlJc w:val="left"/>
+      <w:pPr>
+        <w:ind w:left="5040" w:hanging="360"/>
+      </w:pPr>
+    </w:lvl>
+    <w:lvl w:ilvl="7">
+      <w:start w:val="1"/>
+      <w:numFmt w:val="bullet"/>
+      <w:lvlText w:val="◦"/>
+      <w:lvlJc w:val="left"/>
+      <w:pPr>
+        <w:ind w:left="5760" w:hanging="360"/>
+      </w:pPr>
+    </w:lvl>
+    <w:lvl w:ilvl="8">
+      <w:start w:val="1"/>
+      <w:numFmt w:val="bullet"/>
+      <w:lvlText w:val="▪"/>
+      <w:lvlJc w:val="left"/>
+      <w:pPr>
+        <w:ind w:left="6480" w:hanging="360"/>
+      </w:pPr>
+    </w:lvl>
+  </w:abstractNum>
+  <w:abstractNum w:abstractNumId="8">
     <w:multiLevelType w:val="hybridMultilevel"/>
     <w:lvl w:ilvl="0">
       <w:start w:val="1"/>
@@ -1520,6 +2584,18 @@
   </w:num>
   <w:num w:numId="5">
     <w:abstractNumId w:val="4"/>
+  </w:num>
+  <w:num w:numId="6">
+    <w:abstractNumId w:val="5"/>
+  </w:num>
+  <w:num w:numId="7">
+    <w:abstractNumId w:val="6"/>
+  </w:num>
+  <w:num w:numId="8">
+    <w:abstractNumId w:val="7"/>
+  </w:num>
+  <w:num w:numId="9">
+    <w:abstractNumId w:val="8"/>
   </w:num>
 </w:numbering>
 </file>

</xml_diff>

<commit_message>
docs: finalize CyberSentinel Project Report with deployment guide, testing strategy, and roadmap
</commit_message>
<xml_diff>
--- a/docs/CyberSentinel_Project_Report.docx
+++ b/docs/CyberSentinel_Project_Report.docx
@@ -1803,6 +1803,889 @@
         <w:t xml:space="preserve">Checkov validates the docker-compose.yml and Kubernetes manifests for IaC misconfigurations before merge.</w:t>
       </w:r>
     </w:p>
+    <w:p>
+      <w:pPr>
+        <w:pStyle w:val="Heading1"/>
+        <w:spacing w:before="400" w:after="160"/>
+      </w:pPr>
+      <w:r>
+        <w:rPr>
+          <w:b/>
+          <w:color w:val="1F2D5A"/>
+          <w:sz w:val="36"/>
+        </w:rPr>
+        <w:t xml:space="preserve">8. Deployment Guide</w:t>
+      </w:r>
+    </w:p>
+    <w:p>
+      <w:pPr>
+        <w:pStyle w:val="Heading2"/>
+        <w:spacing w:before="240" w:after="120"/>
+      </w:pPr>
+      <w:r>
+        <w:rPr>
+          <w:b/>
+          <w:color w:val="1F2D5A"/>
+          <w:sz w:val="28"/>
+        </w:rPr>
+        <w:t xml:space="preserve">8.1 Prerequisites</w:t>
+      </w:r>
+    </w:p>
+    <w:p>
+      <w:pPr>
+        <w:pStyle w:val="Normal"/>
+        <w:numPr>
+          <w:ilvl w:val="0"/>
+          <w:numId w:val="10"/>
+        </w:numPr>
+        <w:spacing w:after="80"/>
+      </w:pPr>
+      <w:r>
+        <w:rPr>
+          <w:sz w:val="22"/>
+        </w:rPr>
+        <w:t xml:space="preserve">Docker Engine 24+ and Docker Compose v2+ (or Docker Desktop on Windows/macOS).</w:t>
+      </w:r>
+    </w:p>
+    <w:p>
+      <w:pPr>
+        <w:pStyle w:val="Normal"/>
+        <w:numPr>
+          <w:ilvl w:val="0"/>
+          <w:numId w:val="10"/>
+        </w:numPr>
+        <w:spacing w:after="80"/>
+      </w:pPr>
+      <w:r>
+        <w:rPr>
+          <w:sz w:val="22"/>
+        </w:rPr>
+        <w:t xml:space="preserve">Node.js v18+ and npm v9+ (only required for local frontend development, not Docker deployments).</w:t>
+      </w:r>
+    </w:p>
+    <w:p>
+      <w:pPr>
+        <w:pStyle w:val="Normal"/>
+        <w:numPr>
+          <w:ilvl w:val="0"/>
+          <w:numId w:val="10"/>
+        </w:numPr>
+        <w:spacing w:after="80"/>
+      </w:pPr>
+      <w:r>
+        <w:rPr>
+          <w:sz w:val="22"/>
+        </w:rPr>
+        <w:t xml:space="preserve">Python 3.11+ with pip (only required for local backend development, not Docker deployments).</w:t>
+      </w:r>
+    </w:p>
+    <w:p>
+      <w:pPr>
+        <w:pStyle w:val="Normal"/>
+        <w:numPr>
+          <w:ilvl w:val="0"/>
+          <w:numId w:val="10"/>
+        </w:numPr>
+        <w:spacing w:after="160"/>
+      </w:pPr>
+      <w:r>
+        <w:rPr>
+          <w:sz w:val="22"/>
+        </w:rPr>
+        <w:t xml:space="preserve">API keys for optional integrations: VIRUSTOTAL_API_KEY, ALIENVAULT_OTX_API_KEY, ABUSEIPDB_API_KEY, OPENAI_API_KEY.</w:t>
+      </w:r>
+    </w:p>
+    <w:p>
+      <w:pPr>
+        <w:pStyle w:val="Heading2"/>
+        <w:spacing w:before="240" w:after="120"/>
+      </w:pPr>
+      <w:r>
+        <w:rPr>
+          <w:b/>
+          <w:color w:val="1F2D5A"/>
+          <w:sz w:val="28"/>
+        </w:rPr>
+        <w:t xml:space="preserve">8.2 Docker Compose Deployment (Recommended)</w:t>
+      </w:r>
+    </w:p>
+    <w:p>
+      <w:pPr>
+        <w:pStyle w:val="Normal"/>
+        <w:numPr>
+          <w:ilvl w:val="0"/>
+          <w:numId w:val="11"/>
+        </w:numPr>
+        <w:spacing w:after="80"/>
+      </w:pPr>
+      <w:r>
+        <w:rPr>
+          <w:sz w:val="22"/>
+        </w:rPr>
+        <w:t xml:space="preserve">Step 1: Clone the repository and enter the project root directory.</w:t>
+      </w:r>
+    </w:p>
+    <w:p>
+      <w:pPr>
+        <w:pStyle w:val="Normal"/>
+        <w:numPr>
+          <w:ilvl w:val="0"/>
+          <w:numId w:val="11"/>
+        </w:numPr>
+        <w:spacing w:after="80"/>
+      </w:pPr>
+      <w:r>
+        <w:rPr>
+          <w:sz w:val="22"/>
+        </w:rPr>
+        <w:t xml:space="preserve">Step 2: Copy .env.example to .env and populate all required secrets (SECRET_KEY, DB_PASSWORD, ZAP_API_KEY, and any optional third-party API keys).</w:t>
+      </w:r>
+    </w:p>
+    <w:p>
+      <w:pPr>
+        <w:pStyle w:val="Normal"/>
+        <w:numPr>
+          <w:ilvl w:val="0"/>
+          <w:numId w:val="11"/>
+        </w:numPr>
+        <w:spacing w:after="80"/>
+      </w:pPr>
+      <w:r>
+        <w:rPr>
+          <w:sz w:val="22"/>
+        </w:rPr>
+        <w:t xml:space="preserve">Step 3: Run docker-compose up -d --build to build and start all eight services: PostgreSQL, Redis, Django backend, Celery worker, Celery Beat, OWASP ZAP, React frontend, and Nginx.</w:t>
+      </w:r>
+    </w:p>
+    <w:p>
+      <w:pPr>
+        <w:pStyle w:val="Normal"/>
+        <w:numPr>
+          <w:ilvl w:val="0"/>
+          <w:numId w:val="11"/>
+        </w:numPr>
+        <w:spacing w:after="160"/>
+      </w:pPr>
+      <w:r>
+        <w:rPr>
+          <w:sz w:val="22"/>
+        </w:rPr>
+        <w:t xml:space="preserve">Step 4: Access the application at http://localhost (Nginx), http://localhost:5173 (frontend dev), and http://localhost:8000/api/docs/ (Swagger UI).</w:t>
+      </w:r>
+    </w:p>
+    <w:p>
+      <w:pPr>
+        <w:pStyle w:val="Heading2"/>
+        <w:spacing w:before="240" w:after="120"/>
+      </w:pPr>
+      <w:r>
+        <w:rPr>
+          <w:b/>
+          <w:color w:val="1F2D5A"/>
+          <w:sz w:val="28"/>
+        </w:rPr>
+        <w:t xml:space="preserve">8.3 Environment Variables</w:t>
+      </w:r>
+    </w:p>
+    <w:p>
+      <w:pPr>
+        <w:pStyle w:val="Normal"/>
+        <w:numPr>
+          <w:ilvl w:val="0"/>
+          <w:numId w:val="12"/>
+        </w:numPr>
+        <w:spacing w:after="80"/>
+      </w:pPr>
+      <w:r>
+        <w:rPr>
+          <w:sz w:val="22"/>
+        </w:rPr>
+        <w:t xml:space="preserve">SECRET_KEY: Django cryptographic secret. Generate with python -c "from django.core.management.utils import get_random_secret_key; print(get_random_secret_key())".</w:t>
+      </w:r>
+    </w:p>
+    <w:p>
+      <w:pPr>
+        <w:pStyle w:val="Normal"/>
+        <w:numPr>
+          <w:ilvl w:val="0"/>
+          <w:numId w:val="12"/>
+        </w:numPr>
+        <w:spacing w:after="80"/>
+      </w:pPr>
+      <w:r>
+        <w:rPr>
+          <w:sz w:val="22"/>
+        </w:rPr>
+        <w:t xml:space="preserve">DEBUG: Set to False in production. Default True for local development.</w:t>
+      </w:r>
+    </w:p>
+    <w:p>
+      <w:pPr>
+        <w:pStyle w:val="Normal"/>
+        <w:numPr>
+          <w:ilvl w:val="0"/>
+          <w:numId w:val="12"/>
+        </w:numPr>
+        <w:spacing w:after="80"/>
+      </w:pPr>
+      <w:r>
+        <w:rPr>
+          <w:sz w:val="22"/>
+        </w:rPr>
+        <w:t xml:space="preserve">DB_NAME, DB_USER, DB_PASSWORD, DB_HOST, DB_PORT: PostgreSQL connection parameters.</w:t>
+      </w:r>
+    </w:p>
+    <w:p>
+      <w:pPr>
+        <w:pStyle w:val="Normal"/>
+        <w:numPr>
+          <w:ilvl w:val="0"/>
+          <w:numId w:val="12"/>
+        </w:numPr>
+        <w:spacing w:after="80"/>
+      </w:pPr>
+      <w:r>
+        <w:rPr>
+          <w:sz w:val="22"/>
+        </w:rPr>
+        <w:t xml:space="preserve">REDIS_URL / CELERY_BROKER_URL: Redis connection URL, e.g. redis://redis:6379/0.</w:t>
+      </w:r>
+    </w:p>
+    <w:p>
+      <w:pPr>
+        <w:pStyle w:val="Normal"/>
+        <w:numPr>
+          <w:ilvl w:val="0"/>
+          <w:numId w:val="12"/>
+        </w:numPr>
+        <w:spacing w:after="80"/>
+      </w:pPr>
+      <w:r>
+        <w:rPr>
+          <w:sz w:val="22"/>
+        </w:rPr>
+        <w:t xml:space="preserve">ZAP_HOST, ZAP_PORT, ZAP_API_KEY: OWASP ZAP daemon connection parameters.</w:t>
+      </w:r>
+    </w:p>
+    <w:p>
+      <w:pPr>
+        <w:pStyle w:val="Normal"/>
+        <w:numPr>
+          <w:ilvl w:val="0"/>
+          <w:numId w:val="12"/>
+        </w:numPr>
+        <w:spacing w:after="80"/>
+      </w:pPr>
+      <w:r>
+        <w:rPr>
+          <w:sz w:val="22"/>
+        </w:rPr>
+        <w:t xml:space="preserve">VIRUSTOTAL_API_KEY, ALIENVAULT_OTX_API_KEY, ABUSEIPDB_API_KEY: Optional threat intelligence API keys.</w:t>
+      </w:r>
+    </w:p>
+    <w:p>
+      <w:pPr>
+        <w:pStyle w:val="Normal"/>
+        <w:numPr>
+          <w:ilvl w:val="0"/>
+          <w:numId w:val="12"/>
+        </w:numPr>
+        <w:spacing w:after="160"/>
+      </w:pPr>
+      <w:r>
+        <w:rPr>
+          <w:sz w:val="22"/>
+        </w:rPr>
+        <w:t xml:space="preserve">OPENAI_API_KEY: Required for the AI Security Analyst module.</w:t>
+      </w:r>
+    </w:p>
+    <w:p>
+      <w:pPr>
+        <w:pStyle w:val="Heading1"/>
+        <w:spacing w:before="400" w:after="160"/>
+      </w:pPr>
+      <w:r>
+        <w:rPr>
+          <w:b/>
+          <w:color w:val="1F2D5A"/>
+          <w:sz w:val="36"/>
+        </w:rPr>
+        <w:t xml:space="preserve">9. Testing Strategy</w:t>
+      </w:r>
+    </w:p>
+    <w:p>
+      <w:pPr>
+        <w:pStyle w:val="Heading2"/>
+        <w:spacing w:before="240" w:after="120"/>
+      </w:pPr>
+      <w:r>
+        <w:rPr>
+          <w:b/>
+          <w:color w:val="1F2D5A"/>
+          <w:sz w:val="28"/>
+        </w:rPr>
+        <w:t xml:space="preserve">9.1 Backend Testing</w:t>
+      </w:r>
+    </w:p>
+    <w:p>
+      <w:pPr>
+        <w:pStyle w:val="Normal"/>
+        <w:spacing w:after="120"/>
+      </w:pPr>
+      <w:r>
+        <w:rPr>
+          <w:sz w:val="22"/>
+        </w:rPr>
+        <w:t xml:space="preserve">The backend test suite uses pytest with the pytest-django plugin. Tests are organised per Django application and cover model validation, serialiser logic, API endpoint behaviour, permission enforcement, and Celery task execution.</w:t>
+      </w:r>
+    </w:p>
+    <w:p>
+      <w:pPr>
+        <w:pStyle w:val="Normal"/>
+        <w:numPr>
+          <w:ilvl w:val="0"/>
+          <w:numId w:val="13"/>
+        </w:numPr>
+        <w:spacing w:after="80"/>
+      </w:pPr>
+      <w:r>
+        <w:rPr>
+          <w:sz w:val="22"/>
+        </w:rPr>
+        <w:t xml:space="preserve">Unit tests: Validate model field constraints, serialiser input/output contracts, and utility function correctness in isolation.</w:t>
+      </w:r>
+    </w:p>
+    <w:p>
+      <w:pPr>
+        <w:pStyle w:val="Normal"/>
+        <w:numPr>
+          <w:ilvl w:val="0"/>
+          <w:numId w:val="13"/>
+        </w:numPr>
+        <w:spacing w:after="80"/>
+      </w:pPr>
+      <w:r>
+        <w:rPr>
+          <w:sz w:val="22"/>
+        </w:rPr>
+        <w:t xml:space="preserve">Integration tests: Use DRF's APITestCase (via pytest-django) to exercise full request/response cycles against an in-memory SQLite database, mocking external APIs (ZAP, VirusTotal, OpenAI) with the responses library.</w:t>
+      </w:r>
+    </w:p>
+    <w:p>
+      <w:pPr>
+        <w:pStyle w:val="Normal"/>
+        <w:numPr>
+          <w:ilvl w:val="0"/>
+          <w:numId w:val="13"/>
+        </w:numPr>
+        <w:spacing w:after="120"/>
+      </w:pPr>
+      <w:r>
+        <w:rPr>
+          <w:sz w:val="22"/>
+        </w:rPr>
+        <w:t xml:space="preserve">Coverage reporting via coverage.py with a minimum 80% line coverage gate enforced in CI.</w:t>
+      </w:r>
+    </w:p>
+    <w:p>
+      <w:pPr>
+        <w:pStyle w:val="Heading2"/>
+        <w:spacing w:before="240" w:after="120"/>
+      </w:pPr>
+      <w:r>
+        <w:rPr>
+          <w:b/>
+          <w:color w:val="1F2D5A"/>
+          <w:sz w:val="28"/>
+        </w:rPr>
+        <w:t xml:space="preserve">9.2 Frontend Testing</w:t>
+      </w:r>
+    </w:p>
+    <w:p>
+      <w:pPr>
+        <w:pStyle w:val="Normal"/>
+        <w:spacing w:after="160"/>
+      </w:pPr>
+      <w:r>
+        <w:rPr>
+          <w:sz w:val="22"/>
+        </w:rPr>
+        <w:t xml:space="preserve">The frontend uses Vitest (Vite-native, Jest-compatible) as the test runner. Component tests validate render output and user interaction flows. API service modules are tested with mocked Axios responses.</w:t>
+      </w:r>
+    </w:p>
+    <w:p>
+      <w:pPr>
+        <w:pStyle w:val="Heading2"/>
+        <w:spacing w:before="240" w:after="120"/>
+      </w:pPr>
+      <w:r>
+        <w:rPr>
+          <w:b/>
+          <w:color w:val="1F2D5A"/>
+          <w:sz w:val="28"/>
+        </w:rPr>
+        <w:t xml:space="preserve">9.3 Security Scanner Engine Testing</w:t>
+      </w:r>
+    </w:p>
+    <w:p>
+      <w:pPr>
+        <w:pStyle w:val="Normal"/>
+        <w:spacing w:after="160"/>
+      </w:pPr>
+      <w:r>
+        <w:rPr>
+          <w:sz w:val="22"/>
+        </w:rPr>
+        <w:t xml:space="preserve">Each security engine has its own pytest suite. HTTP interactions are mocked with the responses library so scanner tests do not require live network access. ZAP API calls are mocked via responses fixtures replicating real ZAP daemon response schemas.</w:t>
+      </w:r>
+    </w:p>
+    <w:p>
+      <w:pPr>
+        <w:pStyle w:val="Heading1"/>
+        <w:spacing w:before="400" w:after="160"/>
+      </w:pPr>
+      <w:r>
+        <w:rPr>
+          <w:b/>
+          <w:color w:val="1F2D5A"/>
+          <w:sz w:val="36"/>
+        </w:rPr>
+        <w:t xml:space="preserve">10. Python Dependencies Summary</w:t>
+      </w:r>
+    </w:p>
+    <w:p>
+      <w:pPr>
+        <w:pStyle w:val="Normal"/>
+        <w:spacing w:after="160"/>
+      </w:pPr>
+      <w:r>
+        <w:rPr>
+          <w:sz w:val="22"/>
+        </w:rPr>
+        <w:t xml:space="preserve">The table below lists all Python packages across every component. Version pins are exact (==) for reproducible builds, except psycopg2-binary and Pillow which use minimum-version constraints (&gt;=) to pick up security patches automatically.</w:t>
+      </w:r>
+    </w:p>
+    <w:p>
+      <w:pPr>
+        <w:pStyle w:val="Normal"/>
+        <w:numPr>
+          <w:ilvl w:val="0"/>
+          <w:numId w:val="14"/>
+        </w:numPr>
+        <w:spacing w:after="80"/>
+      </w:pPr>
+      <w:r>
+        <w:rPr>
+          <w:sz w:val="22"/>
+        </w:rPr>
+        <w:t xml:space="preserve">Backend (backend/requirements.txt): Django 4.2.9, djangorestframework 3.14.0, djangorestframework-simplejwt 5.3.1, channels 4.0.0, channels-redis 4.1.0, django-cors-headers 4.3.1, django-filter 23.5, django-celery-beat 2.5.0, django-celery-results 2.5.1, celery 5.3.6, redis 5.0.1, psycopg2-binary &gt;=2.9.9, gunicorn 21.2.0, uvicorn[standard] 0.25.0, whitenoise 6.6.0, Pillow &gt;=10.4.0, python-decouple 3.8, drf-spectacular 0.27.0, argon2-cffi 23.1.0, requests 2.31.0, openai 1.10.0, python-dateutil 2.8.2, dj-database-url 2.1.0, pytest 7.4.4, pytest-django 4.7.0, coverage 7.4.0.</w:t>
+      </w:r>
+    </w:p>
+    <w:p>
+      <w:pPr>
+        <w:pStyle w:val="Normal"/>
+        <w:numPr>
+          <w:ilvl w:val="0"/>
+          <w:numId w:val="14"/>
+        </w:numPr>
+        <w:spacing w:after="80"/>
+      </w:pPr>
+      <w:r>
+        <w:rPr>
+          <w:sz w:val="22"/>
+        </w:rPr>
+        <w:t xml:space="preserve">Web Scanner (security-engines/web-scanner/requirements.txt): beautifulsoup4 4.12.3, lxml 5.1.0, python-zapv2 0.0.21, certifi 2024.2.2, urllib3 2.2.1, sslyze 5.2.0, cryptography 42.0.5, dnspython 2.6.1, validators 0.22.0.</w:t>
+      </w:r>
+    </w:p>
+    <w:p>
+      <w:pPr>
+        <w:pStyle w:val="Normal"/>
+        <w:numPr>
+          <w:ilvl w:val="0"/>
+          <w:numId w:val="14"/>
+        </w:numPr>
+        <w:spacing w:after="80"/>
+      </w:pPr>
+      <w:r>
+        <w:rPr>
+          <w:sz w:val="22"/>
+        </w:rPr>
+        <w:t xml:space="preserve">API Scanner (security-engines/api-scanner/requirements.txt): pyyaml 6.0.1, jsonschema 4.21.1, openapi-spec-validator 0.7.1, prance 23.6.21.0.</w:t>
+      </w:r>
+    </w:p>
+    <w:p>
+      <w:pPr>
+        <w:pStyle w:val="Normal"/>
+        <w:numPr>
+          <w:ilvl w:val="0"/>
+          <w:numId w:val="14"/>
+        </w:numPr>
+        <w:spacing w:after="80"/>
+      </w:pPr>
+      <w:r>
+        <w:rPr>
+          <w:sz w:val="22"/>
+        </w:rPr>
+        <w:t xml:space="preserve">CORS Analyzer (security-engines/cors-analyzer/requirements.txt): requests, urllib3, validators.</w:t>
+      </w:r>
+    </w:p>
+    <w:p>
+      <w:pPr>
+        <w:pStyle w:val="Normal"/>
+        <w:numPr>
+          <w:ilvl w:val="0"/>
+          <w:numId w:val="14"/>
+        </w:numPr>
+        <w:spacing w:after="80"/>
+      </w:pPr>
+      <w:r>
+        <w:rPr>
+          <w:sz w:val="22"/>
+        </w:rPr>
+        <w:t xml:space="preserve">Header Analyzer (security-engines/header-analyzer/requirements.txt): requests, urllib3, validators, cachetools 5.3.2.</w:t>
+      </w:r>
+    </w:p>
+    <w:p>
+      <w:pPr>
+        <w:pStyle w:val="Normal"/>
+        <w:numPr>
+          <w:ilvl w:val="0"/>
+          <w:numId w:val="14"/>
+        </w:numPr>
+        <w:spacing w:after="160"/>
+      </w:pPr>
+      <w:r>
+        <w:rPr>
+          <w:sz w:val="22"/>
+        </w:rPr>
+        <w:t xml:space="preserve">Risk Engine (security-engines/risk-engine/requirements.txt): numpy 1.26.4, scipy 1.12.0, cachetools 5.3.2, python-dateutil 2.8.2, pyyaml 6.0.1.</w:t>
+      </w:r>
+    </w:p>
+    <w:p>
+      <w:pPr>
+        <w:spacing w:before="480"/>
+        <w:jc w:val="center"/>
+      </w:pPr>
+      <w:r>
+        <w:rPr>
+          <w:color w:val="57606A"/>
+          <w:sz w:val="18"/>
+        </w:rPr>
+        <w:t xml:space="preserve">CyberSentinel Project Report  |  Confidential</w:t>
+      </w:r>
+    </w:p>
+    <w:p>
+      <w:pPr>
+        <w:pStyle w:val="Heading1"/>
+        <w:spacing w:before="400" w:after="160"/>
+      </w:pPr>
+      <w:r>
+        <w:rPr>
+          <w:b/>
+          <w:color w:val="1F2D5A"/>
+          <w:sz w:val="36"/>
+        </w:rPr>
+        <w:t xml:space="preserve">11. Repository Structure</w:t>
+      </w:r>
+    </w:p>
+    <w:p>
+      <w:pPr>
+        <w:pStyle w:val="Normal"/>
+        <w:spacing w:after="120"/>
+      </w:pPr>
+      <w:r>
+        <w:rPr>
+          <w:sz w:val="22"/>
+        </w:rPr>
+        <w:t xml:space="preserve">The repository follows a monorepo layout with clear separation between the frontend, backend, security engines, documentation, and infrastructure:</w:t>
+      </w:r>
+    </w:p>
+    <w:p>
+      <w:pPr>
+        <w:pStyle w:val="Normal"/>
+        <w:numPr>
+          <w:ilvl w:val="0"/>
+          <w:numId w:val="15"/>
+        </w:numPr>
+        <w:spacing w:after="80"/>
+      </w:pPr>
+      <w:r>
+        <w:rPr>
+          <w:sz w:val="22"/>
+        </w:rPr>
+        <w:t xml:space="preserve">.github/workflows/ — Automated CI/CD security audit workflow (Bandit, Trivy, Semgrep, Checkov).</w:t>
+      </w:r>
+    </w:p>
+    <w:p>
+      <w:pPr>
+        <w:pStyle w:val="Normal"/>
+        <w:numPr>
+          <w:ilvl w:val="0"/>
+          <w:numId w:val="15"/>
+        </w:numPr>
+        <w:spacing w:after="80"/>
+      </w:pPr>
+      <w:r>
+        <w:rPr>
+          <w:sz w:val="22"/>
+        </w:rPr>
+        <w:t xml:space="preserve">backend/ — Django REST + Channels application with 17 Django apps covering all security domains.</w:t>
+      </w:r>
+    </w:p>
+    <w:p>
+      <w:pPr>
+        <w:pStyle w:val="Normal"/>
+        <w:numPr>
+          <w:ilvl w:val="0"/>
+          <w:numId w:val="15"/>
+        </w:numPr>
+        <w:spacing w:after="80"/>
+      </w:pPr>
+      <w:r>
+        <w:rPr>
+          <w:sz w:val="22"/>
+        </w:rPr>
+        <w:t xml:space="preserve">frontend/ — React 18 + TypeScript + Vite SPA with Three.js 3D holographic interface.</w:t>
+      </w:r>
+    </w:p>
+    <w:p>
+      <w:pPr>
+        <w:pStyle w:val="Normal"/>
+        <w:numPr>
+          <w:ilvl w:val="0"/>
+          <w:numId w:val="15"/>
+        </w:numPr>
+        <w:spacing w:after="80"/>
+      </w:pPr>
+      <w:r>
+        <w:rPr>
+          <w:sz w:val="22"/>
+        </w:rPr>
+        <w:t xml:space="preserve">security-engines/ — Five standalone Python scanner/analyser packages: web-scanner, api-scanner, cors-analyzer, header-analyzer, risk-engine.</w:t>
+      </w:r>
+    </w:p>
+    <w:p>
+      <w:pPr>
+        <w:pStyle w:val="Normal"/>
+        <w:numPr>
+          <w:ilvl w:val="0"/>
+          <w:numId w:val="15"/>
+        </w:numPr>
+        <w:spacing w:after="80"/>
+      </w:pPr>
+      <w:r>
+        <w:rPr>
+          <w:sz w:val="22"/>
+        </w:rPr>
+        <w:t xml:space="preserve">detection-engine/ — Placeholder for the next-generation stream-processing detection engine.</w:t>
+      </w:r>
+    </w:p>
+    <w:p>
+      <w:pPr>
+        <w:pStyle w:val="Normal"/>
+        <w:numPr>
+          <w:ilvl w:val="0"/>
+          <w:numId w:val="15"/>
+        </w:numPr>
+        <w:spacing w:after="80"/>
+      </w:pPr>
+      <w:r>
+        <w:rPr>
+          <w:sz w:val="22"/>
+        </w:rPr>
+        <w:t xml:space="preserve">threat-intelligence/ — Placeholder for the standalone threat intelligence feed aggregator service.</w:t>
+      </w:r>
+    </w:p>
+    <w:p>
+      <w:pPr>
+        <w:pStyle w:val="Normal"/>
+        <w:numPr>
+          <w:ilvl w:val="0"/>
+          <w:numId w:val="15"/>
+        </w:numPr>
+        <w:spacing w:after="80"/>
+      </w:pPr>
+      <w:r>
+        <w:rPr>
+          <w:sz w:val="22"/>
+        </w:rPr>
+        <w:t xml:space="preserve">docs/ — Architecture, API reference, roadmap, and this project report.</w:t>
+      </w:r>
+    </w:p>
+    <w:p>
+      <w:pPr>
+        <w:pStyle w:val="Normal"/>
+        <w:numPr>
+          <w:ilvl w:val="0"/>
+          <w:numId w:val="15"/>
+        </w:numPr>
+        <w:spacing w:after="80"/>
+      </w:pPr>
+      <w:r>
+        <w:rPr>
+          <w:sz w:val="22"/>
+        </w:rPr>
+        <w:t xml:space="preserve">infrastructure/ — Nginx configuration, Docker helpers, Kubernetes manifests, and Terraform IaC.</w:t>
+      </w:r>
+    </w:p>
+    <w:p>
+      <w:pPr>
+        <w:pStyle w:val="Normal"/>
+        <w:numPr>
+          <w:ilvl w:val="0"/>
+          <w:numId w:val="15"/>
+        </w:numPr>
+        <w:spacing w:after="160"/>
+      </w:pPr>
+      <w:r>
+        <w:rPr>
+          <w:sz w:val="22"/>
+        </w:rPr>
+        <w:t xml:space="preserve">docker-compose.yml — Single-command multi-container orchestration for all eight services.</w:t>
+      </w:r>
+    </w:p>
+    <w:p>
+      <w:pPr>
+        <w:pStyle w:val="Heading1"/>
+        <w:spacing w:before="400" w:after="160"/>
+      </w:pPr>
+      <w:r>
+        <w:rPr>
+          <w:b/>
+          <w:color w:val="1F2D5A"/>
+          <w:sz w:val="36"/>
+        </w:rPr>
+        <w:t xml:space="preserve">12. Roadmap</w:t>
+      </w:r>
+    </w:p>
+    <w:p>
+      <w:pPr>
+        <w:pStyle w:val="Normal"/>
+        <w:numPr>
+          <w:ilvl w:val="0"/>
+          <w:numId w:val="16"/>
+        </w:numPr>
+        <w:spacing w:after="80"/>
+      </w:pPr>
+      <w:r>
+        <w:rPr>
+          <w:sz w:val="22"/>
+        </w:rPr>
+        <w:t xml:space="preserve">Phase 1 — Foundation (Completed): Full-stack scaffolding, Docker Compose orchestration, JWT authentication, RBAC, PostgreSQL schema, Redis integration, and CI/CD security pipeline.</w:t>
+      </w:r>
+    </w:p>
+    <w:p>
+      <w:pPr>
+        <w:pStyle w:val="Normal"/>
+        <w:numPr>
+          <w:ilvl w:val="0"/>
+          <w:numId w:val="16"/>
+        </w:numPr>
+        <w:spacing w:after="80"/>
+      </w:pPr>
+      <w:r>
+        <w:rPr>
+          <w:sz w:val="22"/>
+        </w:rPr>
+        <w:t xml:space="preserve">Phase 2 — Core Security Modules (Completed): Web and API security scanners, OWASP ZAP integration, vulnerability lifecycle management, SIEM event ingestion, real-time WebSocket streaming, and basic threat detection rules.</w:t>
+      </w:r>
+    </w:p>
+    <w:p>
+      <w:pPr>
+        <w:pStyle w:val="Normal"/>
+        <w:numPr>
+          <w:ilvl w:val="0"/>
+          <w:numId w:val="16"/>
+        </w:numPr>
+        <w:spacing w:after="80"/>
+      </w:pPr>
+      <w:r>
+        <w:rPr>
+          <w:sz w:val="22"/>
+        </w:rPr>
+        <w:t xml:space="preserve">Phase 3 — Intelligence and AI (Completed): Threat intelligence IOC enrichment (VirusTotal, AlienVault OTX, AbuseIPDB), dynamic risk scoring engine, AI Security Analyst (OpenAI GPT), and 3D holographic command-centre frontend.</w:t>
+      </w:r>
+    </w:p>
+    <w:p>
+      <w:pPr>
+        <w:pStyle w:val="Normal"/>
+        <w:numPr>
+          <w:ilvl w:val="0"/>
+          <w:numId w:val="16"/>
+        </w:numPr>
+        <w:spacing w:after="160"/>
+      </w:pPr>
+      <w:r>
+        <w:rPr>
+          <w:sz w:val="22"/>
+        </w:rPr>
+        <w:t xml:space="preserve">Phase 4 — Enterprise Features (Planned): Kubernetes deployment manifests and Terraform IaC for AWS/GCP/Azure, SAML 2.0 and OpenID Connect SSO, STIX 2.1 threat intelligence export, mobile-responsive dashboard, Slack and PagerDuty notification integrations.</w:t>
+      </w:r>
+    </w:p>
+    <w:p>
+      <w:pPr>
+        <w:pStyle w:val="Heading1"/>
+        <w:spacing w:before="400" w:after="160"/>
+      </w:pPr>
+      <w:r>
+        <w:rPr>
+          <w:b/>
+          <w:color w:val="1F2D5A"/>
+          <w:sz w:val="36"/>
+        </w:rPr>
+        <w:t xml:space="preserve">13. Conclusion</w:t>
+      </w:r>
+    </w:p>
+    <w:p>
+      <w:pPr>
+        <w:pStyle w:val="Normal"/>
+        <w:spacing w:after="160"/>
+      </w:pPr>
+      <w:r>
+        <w:rPr>
+          <w:sz w:val="22"/>
+        </w:rPr>
+        <w:t xml:space="preserve">CyberSentinel successfully delivers a unified, enterprise-grade security operations platform that addresses the fragmentation problem in modern cybersecurity tooling. By combining automated AppSec testing, SIEM-style event streaming, threat intelligence enrichment, dynamic risk scoring, SOC incident management, AI-assisted triage, and DevSecOps integration into a single coherent platform, it reduces analyst context-switching and accelerates mean time to detect (MTTD) and mean time to respond (MTTR).</w:t>
+      </w:r>
+    </w:p>
+    <w:p>
+      <w:pPr>
+        <w:pStyle w:val="Normal"/>
+        <w:spacing w:after="160"/>
+      </w:pPr>
+      <w:r>
+        <w:rPr>
+          <w:sz w:val="22"/>
+        </w:rPr>
+        <w:t xml:space="preserve">The platform is production-ready within Docker Compose and is structured to scale horizontally. Celery workers scale independently, the Django backend runs behind Gunicorn with multiple Uvicorn workers, and the architecture is Kubernetes-ready for cloud deployments.</w:t>
+      </w:r>
+    </w:p>
+    <w:p>
+      <w:pPr>
+        <w:pStyle w:val="Normal"/>
+        <w:spacing w:after="320"/>
+      </w:pPr>
+      <w:r>
+        <w:rPr>
+          <w:sz w:val="22"/>
+        </w:rPr>
+        <w:t xml:space="preserve">All source code is released under the MIT License. Security disclosures should be sent to security@cybersentinel.io in accordance with the responsible disclosure policy in SECURITY.md.</w:t>
+      </w:r>
+    </w:p>
+    <w:p>
+      <w:pPr>
+        <w:pStyle w:val="Normal"/>
+        <w:spacing w:before="320" w:after="80"/>
+        <w:jc w:val="center"/>
+      </w:pPr>
+      <w:r>
+        <w:rPr>
+          <w:color w:val="57606A"/>
+          <w:sz w:val="22"/>
+        </w:rPr>
+        <w:t xml:space="preserve">Developed by Suyog Shelke  |  github.com/suyogshelke  |  MIT License</w:t>
+      </w:r>
+    </w:p>
     <w:sectPr>
       <w:pgSz w:w="11906" w:h="16838"/>
       <w:pgMar w:top="1440" w:right="1800" w:bottom="1440" w:left="1800"/>
@@ -2487,6 +3370,594 @@
     </w:lvl>
   </w:abstractNum>
   <w:abstractNum w:abstractNumId="8">
+    <w:multiLevelType w:val="hybridMultilevel"/>
+    <w:lvl w:ilvl="0">
+      <w:start w:val="1"/>
+      <w:numFmt w:val="bullet"/>
+      <w:lvlText w:val="•"/>
+      <w:lvlJc w:val="left"/>
+      <w:pPr>
+        <w:ind w:left="720" w:hanging="360"/>
+      </w:pPr>
+    </w:lvl>
+    <w:lvl w:ilvl="1">
+      <w:start w:val="1"/>
+      <w:numFmt w:val="bullet"/>
+      <w:lvlText w:val="◦"/>
+      <w:lvlJc w:val="left"/>
+      <w:pPr>
+        <w:ind w:left="1440" w:hanging="360"/>
+      </w:pPr>
+    </w:lvl>
+    <w:lvl w:ilvl="2">
+      <w:start w:val="1"/>
+      <w:numFmt w:val="bullet"/>
+      <w:lvlText w:val="▪"/>
+      <w:lvlJc w:val="left"/>
+      <w:pPr>
+        <w:ind w:left="2160" w:hanging="360"/>
+      </w:pPr>
+    </w:lvl>
+    <w:lvl w:ilvl="3">
+      <w:start w:val="1"/>
+      <w:numFmt w:val="bullet"/>
+      <w:lvlText w:val="•"/>
+      <w:lvlJc w:val="left"/>
+      <w:pPr>
+        <w:ind w:left="2880" w:hanging="360"/>
+      </w:pPr>
+    </w:lvl>
+    <w:lvl w:ilvl="4">
+      <w:start w:val="1"/>
+      <w:numFmt w:val="bullet"/>
+      <w:lvlText w:val="◦"/>
+      <w:lvlJc w:val="left"/>
+      <w:pPr>
+        <w:ind w:left="3600" w:hanging="360"/>
+      </w:pPr>
+    </w:lvl>
+    <w:lvl w:ilvl="5">
+      <w:start w:val="1"/>
+      <w:numFmt w:val="bullet"/>
+      <w:lvlText w:val="▪"/>
+      <w:lvlJc w:val="left"/>
+      <w:pPr>
+        <w:ind w:left="4320" w:hanging="360"/>
+      </w:pPr>
+    </w:lvl>
+    <w:lvl w:ilvl="6">
+      <w:start w:val="1"/>
+      <w:numFmt w:val="bullet"/>
+      <w:lvlText w:val="•"/>
+      <w:lvlJc w:val="left"/>
+      <w:pPr>
+        <w:ind w:left="5040" w:hanging="360"/>
+      </w:pPr>
+    </w:lvl>
+    <w:lvl w:ilvl="7">
+      <w:start w:val="1"/>
+      <w:numFmt w:val="bullet"/>
+      <w:lvlText w:val="◦"/>
+      <w:lvlJc w:val="left"/>
+      <w:pPr>
+        <w:ind w:left="5760" w:hanging="360"/>
+      </w:pPr>
+    </w:lvl>
+    <w:lvl w:ilvl="8">
+      <w:start w:val="1"/>
+      <w:numFmt w:val="bullet"/>
+      <w:lvlText w:val="▪"/>
+      <w:lvlJc w:val="left"/>
+      <w:pPr>
+        <w:ind w:left="6480" w:hanging="360"/>
+      </w:pPr>
+    </w:lvl>
+  </w:abstractNum>
+  <w:abstractNum w:abstractNumId="9">
+    <w:multiLevelType w:val="hybridMultilevel"/>
+    <w:lvl w:ilvl="0">
+      <w:start w:val="1"/>
+      <w:numFmt w:val="bullet"/>
+      <w:lvlText w:val="•"/>
+      <w:lvlJc w:val="left"/>
+      <w:pPr>
+        <w:ind w:left="720" w:hanging="360"/>
+      </w:pPr>
+    </w:lvl>
+    <w:lvl w:ilvl="1">
+      <w:start w:val="1"/>
+      <w:numFmt w:val="bullet"/>
+      <w:lvlText w:val="◦"/>
+      <w:lvlJc w:val="left"/>
+      <w:pPr>
+        <w:ind w:left="1440" w:hanging="360"/>
+      </w:pPr>
+    </w:lvl>
+    <w:lvl w:ilvl="2">
+      <w:start w:val="1"/>
+      <w:numFmt w:val="bullet"/>
+      <w:lvlText w:val="▪"/>
+      <w:lvlJc w:val="left"/>
+      <w:pPr>
+        <w:ind w:left="2160" w:hanging="360"/>
+      </w:pPr>
+    </w:lvl>
+    <w:lvl w:ilvl="3">
+      <w:start w:val="1"/>
+      <w:numFmt w:val="bullet"/>
+      <w:lvlText w:val="•"/>
+      <w:lvlJc w:val="left"/>
+      <w:pPr>
+        <w:ind w:left="2880" w:hanging="360"/>
+      </w:pPr>
+    </w:lvl>
+    <w:lvl w:ilvl="4">
+      <w:start w:val="1"/>
+      <w:numFmt w:val="bullet"/>
+      <w:lvlText w:val="◦"/>
+      <w:lvlJc w:val="left"/>
+      <w:pPr>
+        <w:ind w:left="3600" w:hanging="360"/>
+      </w:pPr>
+    </w:lvl>
+    <w:lvl w:ilvl="5">
+      <w:start w:val="1"/>
+      <w:numFmt w:val="bullet"/>
+      <w:lvlText w:val="▪"/>
+      <w:lvlJc w:val="left"/>
+      <w:pPr>
+        <w:ind w:left="4320" w:hanging="360"/>
+      </w:pPr>
+    </w:lvl>
+    <w:lvl w:ilvl="6">
+      <w:start w:val="1"/>
+      <w:numFmt w:val="bullet"/>
+      <w:lvlText w:val="•"/>
+      <w:lvlJc w:val="left"/>
+      <w:pPr>
+        <w:ind w:left="5040" w:hanging="360"/>
+      </w:pPr>
+    </w:lvl>
+    <w:lvl w:ilvl="7">
+      <w:start w:val="1"/>
+      <w:numFmt w:val="bullet"/>
+      <w:lvlText w:val="◦"/>
+      <w:lvlJc w:val="left"/>
+      <w:pPr>
+        <w:ind w:left="5760" w:hanging="360"/>
+      </w:pPr>
+    </w:lvl>
+    <w:lvl w:ilvl="8">
+      <w:start w:val="1"/>
+      <w:numFmt w:val="bullet"/>
+      <w:lvlText w:val="▪"/>
+      <w:lvlJc w:val="left"/>
+      <w:pPr>
+        <w:ind w:left="6480" w:hanging="360"/>
+      </w:pPr>
+    </w:lvl>
+  </w:abstractNum>
+  <w:abstractNum w:abstractNumId="10">
+    <w:multiLevelType w:val="hybridMultilevel"/>
+    <w:lvl w:ilvl="0">
+      <w:start w:val="1"/>
+      <w:numFmt w:val="bullet"/>
+      <w:lvlText w:val="•"/>
+      <w:lvlJc w:val="left"/>
+      <w:pPr>
+        <w:ind w:left="720" w:hanging="360"/>
+      </w:pPr>
+    </w:lvl>
+    <w:lvl w:ilvl="1">
+      <w:start w:val="1"/>
+      <w:numFmt w:val="bullet"/>
+      <w:lvlText w:val="◦"/>
+      <w:lvlJc w:val="left"/>
+      <w:pPr>
+        <w:ind w:left="1440" w:hanging="360"/>
+      </w:pPr>
+    </w:lvl>
+    <w:lvl w:ilvl="2">
+      <w:start w:val="1"/>
+      <w:numFmt w:val="bullet"/>
+      <w:lvlText w:val="▪"/>
+      <w:lvlJc w:val="left"/>
+      <w:pPr>
+        <w:ind w:left="2160" w:hanging="360"/>
+      </w:pPr>
+    </w:lvl>
+    <w:lvl w:ilvl="3">
+      <w:start w:val="1"/>
+      <w:numFmt w:val="bullet"/>
+      <w:lvlText w:val="•"/>
+      <w:lvlJc w:val="left"/>
+      <w:pPr>
+        <w:ind w:left="2880" w:hanging="360"/>
+      </w:pPr>
+    </w:lvl>
+    <w:lvl w:ilvl="4">
+      <w:start w:val="1"/>
+      <w:numFmt w:val="bullet"/>
+      <w:lvlText w:val="◦"/>
+      <w:lvlJc w:val="left"/>
+      <w:pPr>
+        <w:ind w:left="3600" w:hanging="360"/>
+      </w:pPr>
+    </w:lvl>
+    <w:lvl w:ilvl="5">
+      <w:start w:val="1"/>
+      <w:numFmt w:val="bullet"/>
+      <w:lvlText w:val="▪"/>
+      <w:lvlJc w:val="left"/>
+      <w:pPr>
+        <w:ind w:left="4320" w:hanging="360"/>
+      </w:pPr>
+    </w:lvl>
+    <w:lvl w:ilvl="6">
+      <w:start w:val="1"/>
+      <w:numFmt w:val="bullet"/>
+      <w:lvlText w:val="•"/>
+      <w:lvlJc w:val="left"/>
+      <w:pPr>
+        <w:ind w:left="5040" w:hanging="360"/>
+      </w:pPr>
+    </w:lvl>
+    <w:lvl w:ilvl="7">
+      <w:start w:val="1"/>
+      <w:numFmt w:val="bullet"/>
+      <w:lvlText w:val="◦"/>
+      <w:lvlJc w:val="left"/>
+      <w:pPr>
+        <w:ind w:left="5760" w:hanging="360"/>
+      </w:pPr>
+    </w:lvl>
+    <w:lvl w:ilvl="8">
+      <w:start w:val="1"/>
+      <w:numFmt w:val="bullet"/>
+      <w:lvlText w:val="▪"/>
+      <w:lvlJc w:val="left"/>
+      <w:pPr>
+        <w:ind w:left="6480" w:hanging="360"/>
+      </w:pPr>
+    </w:lvl>
+  </w:abstractNum>
+  <w:abstractNum w:abstractNumId="11">
+    <w:multiLevelType w:val="hybridMultilevel"/>
+    <w:lvl w:ilvl="0">
+      <w:start w:val="1"/>
+      <w:numFmt w:val="bullet"/>
+      <w:lvlText w:val="•"/>
+      <w:lvlJc w:val="left"/>
+      <w:pPr>
+        <w:ind w:left="720" w:hanging="360"/>
+      </w:pPr>
+    </w:lvl>
+    <w:lvl w:ilvl="1">
+      <w:start w:val="1"/>
+      <w:numFmt w:val="bullet"/>
+      <w:lvlText w:val="◦"/>
+      <w:lvlJc w:val="left"/>
+      <w:pPr>
+        <w:ind w:left="1440" w:hanging="360"/>
+      </w:pPr>
+    </w:lvl>
+    <w:lvl w:ilvl="2">
+      <w:start w:val="1"/>
+      <w:numFmt w:val="bullet"/>
+      <w:lvlText w:val="▪"/>
+      <w:lvlJc w:val="left"/>
+      <w:pPr>
+        <w:ind w:left="2160" w:hanging="360"/>
+      </w:pPr>
+    </w:lvl>
+    <w:lvl w:ilvl="3">
+      <w:start w:val="1"/>
+      <w:numFmt w:val="bullet"/>
+      <w:lvlText w:val="•"/>
+      <w:lvlJc w:val="left"/>
+      <w:pPr>
+        <w:ind w:left="2880" w:hanging="360"/>
+      </w:pPr>
+    </w:lvl>
+    <w:lvl w:ilvl="4">
+      <w:start w:val="1"/>
+      <w:numFmt w:val="bullet"/>
+      <w:lvlText w:val="◦"/>
+      <w:lvlJc w:val="left"/>
+      <w:pPr>
+        <w:ind w:left="3600" w:hanging="360"/>
+      </w:pPr>
+    </w:lvl>
+    <w:lvl w:ilvl="5">
+      <w:start w:val="1"/>
+      <w:numFmt w:val="bullet"/>
+      <w:lvlText w:val="▪"/>
+      <w:lvlJc w:val="left"/>
+      <w:pPr>
+        <w:ind w:left="4320" w:hanging="360"/>
+      </w:pPr>
+    </w:lvl>
+    <w:lvl w:ilvl="6">
+      <w:start w:val="1"/>
+      <w:numFmt w:val="bullet"/>
+      <w:lvlText w:val="•"/>
+      <w:lvlJc w:val="left"/>
+      <w:pPr>
+        <w:ind w:left="5040" w:hanging="360"/>
+      </w:pPr>
+    </w:lvl>
+    <w:lvl w:ilvl="7">
+      <w:start w:val="1"/>
+      <w:numFmt w:val="bullet"/>
+      <w:lvlText w:val="◦"/>
+      <w:lvlJc w:val="left"/>
+      <w:pPr>
+        <w:ind w:left="5760" w:hanging="360"/>
+      </w:pPr>
+    </w:lvl>
+    <w:lvl w:ilvl="8">
+      <w:start w:val="1"/>
+      <w:numFmt w:val="bullet"/>
+      <w:lvlText w:val="▪"/>
+      <w:lvlJc w:val="left"/>
+      <w:pPr>
+        <w:ind w:left="6480" w:hanging="360"/>
+      </w:pPr>
+    </w:lvl>
+  </w:abstractNum>
+  <w:abstractNum w:abstractNumId="12">
+    <w:multiLevelType w:val="hybridMultilevel"/>
+    <w:lvl w:ilvl="0">
+      <w:start w:val="1"/>
+      <w:numFmt w:val="bullet"/>
+      <w:lvlText w:val="•"/>
+      <w:lvlJc w:val="left"/>
+      <w:pPr>
+        <w:ind w:left="720" w:hanging="360"/>
+      </w:pPr>
+    </w:lvl>
+    <w:lvl w:ilvl="1">
+      <w:start w:val="1"/>
+      <w:numFmt w:val="bullet"/>
+      <w:lvlText w:val="◦"/>
+      <w:lvlJc w:val="left"/>
+      <w:pPr>
+        <w:ind w:left="1440" w:hanging="360"/>
+      </w:pPr>
+    </w:lvl>
+    <w:lvl w:ilvl="2">
+      <w:start w:val="1"/>
+      <w:numFmt w:val="bullet"/>
+      <w:lvlText w:val="▪"/>
+      <w:lvlJc w:val="left"/>
+      <w:pPr>
+        <w:ind w:left="2160" w:hanging="360"/>
+      </w:pPr>
+    </w:lvl>
+    <w:lvl w:ilvl="3">
+      <w:start w:val="1"/>
+      <w:numFmt w:val="bullet"/>
+      <w:lvlText w:val="•"/>
+      <w:lvlJc w:val="left"/>
+      <w:pPr>
+        <w:ind w:left="2880" w:hanging="360"/>
+      </w:pPr>
+    </w:lvl>
+    <w:lvl w:ilvl="4">
+      <w:start w:val="1"/>
+      <w:numFmt w:val="bullet"/>
+      <w:lvlText w:val="◦"/>
+      <w:lvlJc w:val="left"/>
+      <w:pPr>
+        <w:ind w:left="3600" w:hanging="360"/>
+      </w:pPr>
+    </w:lvl>
+    <w:lvl w:ilvl="5">
+      <w:start w:val="1"/>
+      <w:numFmt w:val="bullet"/>
+      <w:lvlText w:val="▪"/>
+      <w:lvlJc w:val="left"/>
+      <w:pPr>
+        <w:ind w:left="4320" w:hanging="360"/>
+      </w:pPr>
+    </w:lvl>
+    <w:lvl w:ilvl="6">
+      <w:start w:val="1"/>
+      <w:numFmt w:val="bullet"/>
+      <w:lvlText w:val="•"/>
+      <w:lvlJc w:val="left"/>
+      <w:pPr>
+        <w:ind w:left="5040" w:hanging="360"/>
+      </w:pPr>
+    </w:lvl>
+    <w:lvl w:ilvl="7">
+      <w:start w:val="1"/>
+      <w:numFmt w:val="bullet"/>
+      <w:lvlText w:val="◦"/>
+      <w:lvlJc w:val="left"/>
+      <w:pPr>
+        <w:ind w:left="5760" w:hanging="360"/>
+      </w:pPr>
+    </w:lvl>
+    <w:lvl w:ilvl="8">
+      <w:start w:val="1"/>
+      <w:numFmt w:val="bullet"/>
+      <w:lvlText w:val="▪"/>
+      <w:lvlJc w:val="left"/>
+      <w:pPr>
+        <w:ind w:left="6480" w:hanging="360"/>
+      </w:pPr>
+    </w:lvl>
+  </w:abstractNum>
+  <w:abstractNum w:abstractNumId="13">
+    <w:multiLevelType w:val="hybridMultilevel"/>
+    <w:lvl w:ilvl="0">
+      <w:start w:val="1"/>
+      <w:numFmt w:val="bullet"/>
+      <w:lvlText w:val="•"/>
+      <w:lvlJc w:val="left"/>
+      <w:pPr>
+        <w:ind w:left="720" w:hanging="360"/>
+      </w:pPr>
+    </w:lvl>
+    <w:lvl w:ilvl="1">
+      <w:start w:val="1"/>
+      <w:numFmt w:val="bullet"/>
+      <w:lvlText w:val="◦"/>
+      <w:lvlJc w:val="left"/>
+      <w:pPr>
+        <w:ind w:left="1440" w:hanging="360"/>
+      </w:pPr>
+    </w:lvl>
+    <w:lvl w:ilvl="2">
+      <w:start w:val="1"/>
+      <w:numFmt w:val="bullet"/>
+      <w:lvlText w:val="▪"/>
+      <w:lvlJc w:val="left"/>
+      <w:pPr>
+        <w:ind w:left="2160" w:hanging="360"/>
+      </w:pPr>
+    </w:lvl>
+    <w:lvl w:ilvl="3">
+      <w:start w:val="1"/>
+      <w:numFmt w:val="bullet"/>
+      <w:lvlText w:val="•"/>
+      <w:lvlJc w:val="left"/>
+      <w:pPr>
+        <w:ind w:left="2880" w:hanging="360"/>
+      </w:pPr>
+    </w:lvl>
+    <w:lvl w:ilvl="4">
+      <w:start w:val="1"/>
+      <w:numFmt w:val="bullet"/>
+      <w:lvlText w:val="◦"/>
+      <w:lvlJc w:val="left"/>
+      <w:pPr>
+        <w:ind w:left="3600" w:hanging="360"/>
+      </w:pPr>
+    </w:lvl>
+    <w:lvl w:ilvl="5">
+      <w:start w:val="1"/>
+      <w:numFmt w:val="bullet"/>
+      <w:lvlText w:val="▪"/>
+      <w:lvlJc w:val="left"/>
+      <w:pPr>
+        <w:ind w:left="4320" w:hanging="360"/>
+      </w:pPr>
+    </w:lvl>
+    <w:lvl w:ilvl="6">
+      <w:start w:val="1"/>
+      <w:numFmt w:val="bullet"/>
+      <w:lvlText w:val="•"/>
+      <w:lvlJc w:val="left"/>
+      <w:pPr>
+        <w:ind w:left="5040" w:hanging="360"/>
+      </w:pPr>
+    </w:lvl>
+    <w:lvl w:ilvl="7">
+      <w:start w:val="1"/>
+      <w:numFmt w:val="bullet"/>
+      <w:lvlText w:val="◦"/>
+      <w:lvlJc w:val="left"/>
+      <w:pPr>
+        <w:ind w:left="5760" w:hanging="360"/>
+      </w:pPr>
+    </w:lvl>
+    <w:lvl w:ilvl="8">
+      <w:start w:val="1"/>
+      <w:numFmt w:val="bullet"/>
+      <w:lvlText w:val="▪"/>
+      <w:lvlJc w:val="left"/>
+      <w:pPr>
+        <w:ind w:left="6480" w:hanging="360"/>
+      </w:pPr>
+    </w:lvl>
+  </w:abstractNum>
+  <w:abstractNum w:abstractNumId="14">
+    <w:multiLevelType w:val="hybridMultilevel"/>
+    <w:lvl w:ilvl="0">
+      <w:start w:val="1"/>
+      <w:numFmt w:val="bullet"/>
+      <w:lvlText w:val="•"/>
+      <w:lvlJc w:val="left"/>
+      <w:pPr>
+        <w:ind w:left="720" w:hanging="360"/>
+      </w:pPr>
+    </w:lvl>
+    <w:lvl w:ilvl="1">
+      <w:start w:val="1"/>
+      <w:numFmt w:val="bullet"/>
+      <w:lvlText w:val="◦"/>
+      <w:lvlJc w:val="left"/>
+      <w:pPr>
+        <w:ind w:left="1440" w:hanging="360"/>
+      </w:pPr>
+    </w:lvl>
+    <w:lvl w:ilvl="2">
+      <w:start w:val="1"/>
+      <w:numFmt w:val="bullet"/>
+      <w:lvlText w:val="▪"/>
+      <w:lvlJc w:val="left"/>
+      <w:pPr>
+        <w:ind w:left="2160" w:hanging="360"/>
+      </w:pPr>
+    </w:lvl>
+    <w:lvl w:ilvl="3">
+      <w:start w:val="1"/>
+      <w:numFmt w:val="bullet"/>
+      <w:lvlText w:val="•"/>
+      <w:lvlJc w:val="left"/>
+      <w:pPr>
+        <w:ind w:left="2880" w:hanging="360"/>
+      </w:pPr>
+    </w:lvl>
+    <w:lvl w:ilvl="4">
+      <w:start w:val="1"/>
+      <w:numFmt w:val="bullet"/>
+      <w:lvlText w:val="◦"/>
+      <w:lvlJc w:val="left"/>
+      <w:pPr>
+        <w:ind w:left="3600" w:hanging="360"/>
+      </w:pPr>
+    </w:lvl>
+    <w:lvl w:ilvl="5">
+      <w:start w:val="1"/>
+      <w:numFmt w:val="bullet"/>
+      <w:lvlText w:val="▪"/>
+      <w:lvlJc w:val="left"/>
+      <w:pPr>
+        <w:ind w:left="4320" w:hanging="360"/>
+      </w:pPr>
+    </w:lvl>
+    <w:lvl w:ilvl="6">
+      <w:start w:val="1"/>
+      <w:numFmt w:val="bullet"/>
+      <w:lvlText w:val="•"/>
+      <w:lvlJc w:val="left"/>
+      <w:pPr>
+        <w:ind w:left="5040" w:hanging="360"/>
+      </w:pPr>
+    </w:lvl>
+    <w:lvl w:ilvl="7">
+      <w:start w:val="1"/>
+      <w:numFmt w:val="bullet"/>
+      <w:lvlText w:val="◦"/>
+      <w:lvlJc w:val="left"/>
+      <w:pPr>
+        <w:ind w:left="5760" w:hanging="360"/>
+      </w:pPr>
+    </w:lvl>
+    <w:lvl w:ilvl="8">
+      <w:start w:val="1"/>
+      <w:numFmt w:val="bullet"/>
+      <w:lvlText w:val="▪"/>
+      <w:lvlJc w:val="left"/>
+      <w:pPr>
+        <w:ind w:left="6480" w:hanging="360"/>
+      </w:pPr>
+    </w:lvl>
+  </w:abstractNum>
+  <w:abstractNum w:abstractNumId="15">
     <w:multiLevelType w:val="hybridMultilevel"/>
     <w:lvl w:ilvl="0">
       <w:start w:val="1"/>
@@ -2596,6 +4067,27 @@
   </w:num>
   <w:num w:numId="9">
     <w:abstractNumId w:val="8"/>
+  </w:num>
+  <w:num w:numId="10">
+    <w:abstractNumId w:val="9"/>
+  </w:num>
+  <w:num w:numId="11">
+    <w:abstractNumId w:val="10"/>
+  </w:num>
+  <w:num w:numId="12">
+    <w:abstractNumId w:val="11"/>
+  </w:num>
+  <w:num w:numId="13">
+    <w:abstractNumId w:val="12"/>
+  </w:num>
+  <w:num w:numId="14">
+    <w:abstractNumId w:val="13"/>
+  </w:num>
+  <w:num w:numId="15">
+    <w:abstractNumId w:val="14"/>
+  </w:num>
+  <w:num w:numId="16">
+    <w:abstractNumId w:val="15"/>
   </w:num>
 </w:numbering>
 </file>

</xml_diff>